<commit_message>
testing REST API  with node.js
</commit_message>
<xml_diff>
--- a/study-materials/Notes App-REST-nodejs.docx
+++ b/study-materials/Notes App-REST-nodejs.docx
@@ -203,12 +203,7 @@
         <w:t>⚙️</w:t>
       </w:r>
       <w:r>
-        <w:t xml:space="preserve"> Step 4</w:t>
-      </w:r>
-      <w:bookmarkStart w:id="0" w:name="_GoBack"/>
-      <w:bookmarkEnd w:id="0"/>
-      <w:r>
-        <w:t xml:space="preserve">: Update </w:t>
+        <w:t xml:space="preserve"> Step 4: Update </w:t>
       </w:r>
       <w:proofErr w:type="spellStart"/>
       <w:proofErr w:type="gramStart"/>
@@ -2691,248 +2686,1194 @@
     </w:p>
     <w:p>
       <w:pPr>
-        <w:spacing w:after="0"/>
-      </w:pPr>
-      <w:r>
+        <w:spacing w:after="0" w:line="240" w:lineRule="auto"/>
+        <w:rPr>
+          <w:rFonts w:ascii="Times New Roman" w:eastAsia="Times New Roman" w:hAnsi="Times New Roman" w:cs="Times New Roman"/>
+          <w:sz w:val="24"/>
+          <w:szCs w:val="24"/>
+          <w:lang w:eastAsia="en-IN" w:bidi="hi-IN"/>
+        </w:rPr>
+      </w:pPr>
+      <w:bookmarkStart w:id="0" w:name="_GoBack"/>
+      <w:bookmarkEnd w:id="0"/>
+      <w:r>
+        <w:rPr>
+          <w:rFonts w:ascii="Times New Roman" w:eastAsia="Times New Roman" w:hAnsi="Times New Roman" w:cs="Times New Roman"/>
+          <w:sz w:val="24"/>
+          <w:szCs w:val="24"/>
+          <w:lang w:eastAsia="en-IN" w:bidi="hi-IN"/>
+        </w:rPr>
         <w:pict>
-          <v:rect id="_x0000_i1069" style="width:0;height:1.5pt" o:hralign="center" o:hrstd="t" o:hr="t" fillcolor="#a0a0a0" stroked="f"/>
+          <v:rect id="_x0000_i1088" style="width:0;height:1.5pt" o:hralign="center" o:hrstd="t" o:hr="t" fillcolor="#a0a0a0" stroked="f"/>
         </w:pict>
       </w:r>
     </w:p>
     <w:p>
       <w:pPr>
-        <w:pStyle w:val="Heading2"/>
-      </w:pPr>
-      <w:r>
-        <w:rPr>
-          <w:rFonts w:ascii="Segoe UI Symbol" w:hAnsi="Segoe UI Symbol" w:cs="Segoe UI Symbol"/>
-        </w:rPr>
-        <w:t>⚠️</w:t>
-      </w:r>
-      <w:r>
-        <w:t xml:space="preserve"> Honest next step (don’t skip this)</w:t>
-      </w:r>
-    </w:p>
-    <w:p>
-      <w:pPr>
-        <w:pStyle w:val="NormalWeb"/>
-      </w:pPr>
-      <w:r>
-        <w:t>Right now, this is:</w:t>
-      </w:r>
-      <w:r>
-        <w:br/>
-      </w:r>
-      <w:r>
-        <w:rPr>
-          <w:rFonts w:ascii="Segoe UI Symbol" w:hAnsi="Segoe UI Symbol" w:cs="Segoe UI Symbol"/>
-        </w:rPr>
-        <w:t>👉</w:t>
-      </w:r>
-      <w:r>
+        <w:spacing w:before="100" w:beforeAutospacing="1" w:after="100" w:afterAutospacing="1" w:line="240" w:lineRule="auto"/>
+        <w:outlineLvl w:val="2"/>
+        <w:rPr>
+          <w:rFonts w:ascii="Times New Roman" w:eastAsia="Times New Roman" w:hAnsi="Times New Roman" w:cs="Times New Roman"/>
+          <w:b/>
+          <w:bCs/>
+          <w:sz w:val="27"/>
+          <w:szCs w:val="27"/>
+          <w:lang w:eastAsia="en-IN" w:bidi="hi-IN"/>
+        </w:rPr>
+      </w:pPr>
+      <w:r>
+        <w:rPr>
+          <w:rFonts w:ascii="Segoe UI Symbol" w:eastAsia="Times New Roman" w:hAnsi="Segoe UI Symbol" w:cs="Segoe UI Symbol"/>
+          <w:b/>
+          <w:bCs/>
+          <w:sz w:val="27"/>
+          <w:szCs w:val="27"/>
+          <w:lang w:eastAsia="en-IN" w:bidi="hi-IN"/>
+        </w:rPr>
+        <w:t>✅</w:t>
+      </w:r>
+      <w:r>
+        <w:rPr>
+          <w:rFonts w:ascii="Times New Roman" w:eastAsia="Times New Roman" w:hAnsi="Times New Roman" w:cs="Times New Roman"/>
+          <w:b/>
+          <w:bCs/>
+          <w:sz w:val="27"/>
+          <w:szCs w:val="27"/>
+          <w:lang w:eastAsia="en-IN" w:bidi="hi-IN"/>
+        </w:rPr>
         <w:t xml:space="preserve"> </w:t>
       </w:r>
-      <w:r>
-        <w:rPr>
-          <w:rStyle w:val="Strong"/>
-        </w:rPr>
-        <w:t>Beginner backend project</w:t>
-      </w:r>
-    </w:p>
-    <w:p>
-      <w:pPr>
-        <w:pStyle w:val="NormalWeb"/>
-      </w:pPr>
-      <w:r>
-        <w:t xml:space="preserve">To make it </w:t>
-      </w:r>
-      <w:r>
-        <w:rPr>
-          <w:rStyle w:val="Strong"/>
-        </w:rPr>
-        <w:t>interview-ready</w:t>
-      </w:r>
-      <w:r>
-        <w:t>, you should upgrade to:</w:t>
-      </w:r>
-    </w:p>
-    <w:p>
-      <w:pPr>
-        <w:pStyle w:val="Heading3"/>
-      </w:pPr>
-      <w:r>
-        <w:rPr>
-          <w:rFonts w:ascii="Segoe UI Symbol" w:hAnsi="Segoe UI Symbol" w:cs="Segoe UI Symbol"/>
-        </w:rPr>
-        <w:t>🔥</w:t>
-      </w:r>
-      <w:r>
-        <w:t xml:space="preserve"> Next:</w:t>
+      <w:proofErr w:type="spellStart"/>
+      <w:r>
+        <w:rPr>
+          <w:rFonts w:ascii="Times New Roman" w:eastAsia="Times New Roman" w:hAnsi="Times New Roman" w:cs="Times New Roman"/>
+          <w:b/>
+          <w:bCs/>
+          <w:sz w:val="27"/>
+          <w:szCs w:val="27"/>
+          <w:lang w:eastAsia="en-IN" w:bidi="hi-IN"/>
+        </w:rPr>
+        <w:t>Zod</w:t>
+      </w:r>
+      <w:proofErr w:type="spellEnd"/>
+      <w:r>
+        <w:rPr>
+          <w:rFonts w:ascii="Times New Roman" w:eastAsia="Times New Roman" w:hAnsi="Times New Roman" w:cs="Times New Roman"/>
+          <w:b/>
+          <w:bCs/>
+          <w:sz w:val="27"/>
+          <w:szCs w:val="27"/>
+          <w:lang w:eastAsia="en-IN" w:bidi="hi-IN"/>
+        </w:rPr>
+        <w:t xml:space="preserve"> Validation Layer</w:t>
       </w:r>
     </w:p>
     <w:p>
       <w:pPr>
         <w:numPr>
           <w:ilvl w:val="0"/>
-          <w:numId w:val="22"/>
+          <w:numId w:val="24"/>
         </w:numPr>
         <w:spacing w:before="100" w:beforeAutospacing="1" w:after="100" w:afterAutospacing="1" w:line="240" w:lineRule="auto"/>
-      </w:pPr>
-      <w:r>
-        <w:t xml:space="preserve">MongoDB + Mongoose (real database) </w:t>
+        <w:rPr>
+          <w:rFonts w:ascii="Times New Roman" w:eastAsia="Times New Roman" w:hAnsi="Times New Roman" w:cs="Times New Roman"/>
+          <w:sz w:val="24"/>
+          <w:szCs w:val="24"/>
+          <w:lang w:eastAsia="en-IN" w:bidi="hi-IN"/>
+        </w:rPr>
+      </w:pPr>
+      <w:r>
+        <w:rPr>
+          <w:rFonts w:ascii="Times New Roman" w:eastAsia="Times New Roman" w:hAnsi="Times New Roman" w:cs="Times New Roman"/>
+          <w:sz w:val="24"/>
+          <w:szCs w:val="24"/>
+          <w:lang w:eastAsia="en-IN" w:bidi="hi-IN"/>
+        </w:rPr>
+        <w:t>Validates request body before saving</w:t>
       </w:r>
     </w:p>
     <w:p>
       <w:pPr>
         <w:numPr>
           <w:ilvl w:val="0"/>
-          <w:numId w:val="22"/>
+          <w:numId w:val="24"/>
         </w:numPr>
         <w:spacing w:before="100" w:beforeAutospacing="1" w:after="100" w:afterAutospacing="1" w:line="240" w:lineRule="auto"/>
-      </w:pPr>
-      <w:r>
-        <w:t>Validation (</w:t>
-      </w:r>
-      <w:proofErr w:type="spellStart"/>
-      <w:r>
-        <w:t>Joi</w:t>
-      </w:r>
-      <w:proofErr w:type="spellEnd"/>
-      <w:r>
-        <w:t>/</w:t>
-      </w:r>
-      <w:proofErr w:type="spellStart"/>
-      <w:r>
-        <w:t>Zod</w:t>
-      </w:r>
-      <w:proofErr w:type="spellEnd"/>
-      <w:r>
-        <w:t xml:space="preserve">) </w:t>
+        <w:rPr>
+          <w:rFonts w:ascii="Times New Roman" w:eastAsia="Times New Roman" w:hAnsi="Times New Roman" w:cs="Times New Roman"/>
+          <w:sz w:val="24"/>
+          <w:szCs w:val="24"/>
+          <w:lang w:eastAsia="en-IN" w:bidi="hi-IN"/>
+        </w:rPr>
+      </w:pPr>
+      <w:r>
+        <w:rPr>
+          <w:rFonts w:ascii="Times New Roman" w:eastAsia="Times New Roman" w:hAnsi="Times New Roman" w:cs="Times New Roman"/>
+          <w:sz w:val="24"/>
+          <w:szCs w:val="24"/>
+          <w:lang w:eastAsia="en-IN" w:bidi="hi-IN"/>
+        </w:rPr>
+        <w:t>Prevents empty title/content</w:t>
       </w:r>
     </w:p>
     <w:p>
       <w:pPr>
         <w:numPr>
           <w:ilvl w:val="0"/>
-          <w:numId w:val="22"/>
+          <w:numId w:val="24"/>
         </w:numPr>
         <w:spacing w:before="100" w:beforeAutospacing="1" w:after="100" w:afterAutospacing="1" w:line="240" w:lineRule="auto"/>
-      </w:pPr>
-      <w:r>
-        <w:t xml:space="preserve">Authentication (JWT) </w:t>
-      </w:r>
-    </w:p>
-    <w:p>
-      <w:pPr>
-        <w:spacing w:after="0"/>
-      </w:pPr>
-      <w:r>
+        <w:rPr>
+          <w:rFonts w:ascii="Times New Roman" w:eastAsia="Times New Roman" w:hAnsi="Times New Roman" w:cs="Times New Roman"/>
+          <w:sz w:val="24"/>
+          <w:szCs w:val="24"/>
+          <w:lang w:eastAsia="en-IN" w:bidi="hi-IN"/>
+        </w:rPr>
+      </w:pPr>
+      <w:r>
+        <w:rPr>
+          <w:rFonts w:ascii="Times New Roman" w:eastAsia="Times New Roman" w:hAnsi="Times New Roman" w:cs="Times New Roman"/>
+          <w:sz w:val="24"/>
+          <w:szCs w:val="24"/>
+          <w:lang w:eastAsia="en-IN" w:bidi="hi-IN"/>
+        </w:rPr>
+        <w:t>Returns structured error responses</w:t>
+      </w:r>
+    </w:p>
+    <w:p>
+      <w:pPr>
+        <w:spacing w:before="100" w:beforeAutospacing="1" w:after="100" w:afterAutospacing="1" w:line="240" w:lineRule="auto"/>
+        <w:outlineLvl w:val="2"/>
+        <w:rPr>
+          <w:rFonts w:ascii="Times New Roman" w:eastAsia="Times New Roman" w:hAnsi="Times New Roman" w:cs="Times New Roman"/>
+          <w:b/>
+          <w:bCs/>
+          <w:sz w:val="27"/>
+          <w:szCs w:val="27"/>
+          <w:lang w:eastAsia="en-IN" w:bidi="hi-IN"/>
+        </w:rPr>
+      </w:pPr>
+      <w:r>
+        <w:rPr>
+          <w:rFonts w:ascii="Segoe UI Symbol" w:eastAsia="Times New Roman" w:hAnsi="Segoe UI Symbol" w:cs="Segoe UI Symbol"/>
+          <w:b/>
+          <w:bCs/>
+          <w:sz w:val="27"/>
+          <w:szCs w:val="27"/>
+          <w:lang w:eastAsia="en-IN" w:bidi="hi-IN"/>
+        </w:rPr>
+        <w:t>📁</w:t>
+      </w:r>
+      <w:r>
+        <w:rPr>
+          <w:rFonts w:ascii="Times New Roman" w:eastAsia="Times New Roman" w:hAnsi="Times New Roman" w:cs="Times New Roman"/>
+          <w:b/>
+          <w:bCs/>
+          <w:sz w:val="27"/>
+          <w:szCs w:val="27"/>
+          <w:lang w:eastAsia="en-IN" w:bidi="hi-IN"/>
+        </w:rPr>
+        <w:t xml:space="preserve"> New Folder</w:t>
+      </w:r>
+    </w:p>
+    <w:p>
+      <w:pPr>
+        <w:tabs>
+          <w:tab w:val="left" w:pos="916"/>
+          <w:tab w:val="left" w:pos="1832"/>
+          <w:tab w:val="left" w:pos="2748"/>
+          <w:tab w:val="left" w:pos="3664"/>
+          <w:tab w:val="left" w:pos="4580"/>
+          <w:tab w:val="left" w:pos="5496"/>
+          <w:tab w:val="left" w:pos="6412"/>
+          <w:tab w:val="left" w:pos="7328"/>
+          <w:tab w:val="left" w:pos="8244"/>
+          <w:tab w:val="left" w:pos="9160"/>
+          <w:tab w:val="left" w:pos="10076"/>
+          <w:tab w:val="left" w:pos="10992"/>
+          <w:tab w:val="left" w:pos="11908"/>
+          <w:tab w:val="left" w:pos="12824"/>
+          <w:tab w:val="left" w:pos="13740"/>
+          <w:tab w:val="left" w:pos="14656"/>
+        </w:tabs>
+        <w:spacing w:after="0" w:line="240" w:lineRule="auto"/>
+        <w:rPr>
+          <w:rFonts w:ascii="Courier New" w:eastAsia="Times New Roman" w:hAnsi="Courier New" w:cs="Courier New"/>
+          <w:sz w:val="20"/>
+          <w:szCs w:val="20"/>
+          <w:lang w:eastAsia="en-IN" w:bidi="hi-IN"/>
+        </w:rPr>
+      </w:pPr>
+      <w:r>
+        <w:rPr>
+          <w:rFonts w:ascii="Courier New" w:eastAsia="Times New Roman" w:hAnsi="Courier New" w:cs="Courier New"/>
+          <w:sz w:val="20"/>
+          <w:szCs w:val="20"/>
+          <w:lang w:eastAsia="en-IN" w:bidi="hi-IN"/>
+        </w:rPr>
+        <w:t>validators/</w:t>
+      </w:r>
+    </w:p>
+    <w:p>
+      <w:pPr>
+        <w:tabs>
+          <w:tab w:val="left" w:pos="916"/>
+          <w:tab w:val="left" w:pos="1832"/>
+          <w:tab w:val="left" w:pos="2748"/>
+          <w:tab w:val="left" w:pos="3664"/>
+          <w:tab w:val="left" w:pos="4580"/>
+          <w:tab w:val="left" w:pos="5496"/>
+          <w:tab w:val="left" w:pos="6412"/>
+          <w:tab w:val="left" w:pos="7328"/>
+          <w:tab w:val="left" w:pos="8244"/>
+          <w:tab w:val="left" w:pos="9160"/>
+          <w:tab w:val="left" w:pos="10076"/>
+          <w:tab w:val="left" w:pos="10992"/>
+          <w:tab w:val="left" w:pos="11908"/>
+          <w:tab w:val="left" w:pos="12824"/>
+          <w:tab w:val="left" w:pos="13740"/>
+          <w:tab w:val="left" w:pos="14656"/>
+        </w:tabs>
+        <w:spacing w:after="0" w:line="240" w:lineRule="auto"/>
+        <w:rPr>
+          <w:rFonts w:ascii="Courier New" w:eastAsia="Times New Roman" w:hAnsi="Courier New" w:cs="Courier New"/>
+          <w:sz w:val="20"/>
+          <w:szCs w:val="20"/>
+          <w:lang w:eastAsia="en-IN" w:bidi="hi-IN"/>
+        </w:rPr>
+      </w:pPr>
+      <w:r>
+        <w:rPr>
+          <w:rFonts w:ascii="Courier New" w:eastAsia="Times New Roman" w:hAnsi="Courier New" w:cs="Courier New"/>
+          <w:sz w:val="20"/>
+          <w:szCs w:val="20"/>
+          <w:lang w:eastAsia="en-IN" w:bidi="hi-IN"/>
+        </w:rPr>
+        <w:t xml:space="preserve">  noteValidator.js</w:t>
+      </w:r>
+    </w:p>
+    <w:p>
+      <w:pPr>
+        <w:spacing w:before="100" w:beforeAutospacing="1" w:after="100" w:afterAutospacing="1" w:line="240" w:lineRule="auto"/>
+        <w:outlineLvl w:val="2"/>
+        <w:rPr>
+          <w:rFonts w:ascii="Times New Roman" w:eastAsia="Times New Roman" w:hAnsi="Times New Roman" w:cs="Times New Roman"/>
+          <w:b/>
+          <w:bCs/>
+          <w:sz w:val="27"/>
+          <w:szCs w:val="27"/>
+          <w:lang w:eastAsia="en-IN" w:bidi="hi-IN"/>
+        </w:rPr>
+      </w:pPr>
+      <w:r>
+        <w:rPr>
+          <w:rFonts w:ascii="Times New Roman" w:eastAsia="Times New Roman" w:hAnsi="Times New Roman" w:cs="Times New Roman"/>
+          <w:b/>
+          <w:bCs/>
+          <w:sz w:val="27"/>
+          <w:szCs w:val="27"/>
+          <w:lang w:eastAsia="en-IN" w:bidi="hi-IN"/>
+        </w:rPr>
+        <w:t>🧠 How validation works</w:t>
+      </w:r>
+    </w:p>
+    <w:p>
+      <w:pPr>
+        <w:tabs>
+          <w:tab w:val="left" w:pos="916"/>
+          <w:tab w:val="left" w:pos="1832"/>
+          <w:tab w:val="left" w:pos="2748"/>
+          <w:tab w:val="left" w:pos="3664"/>
+          <w:tab w:val="left" w:pos="4580"/>
+          <w:tab w:val="left" w:pos="5496"/>
+          <w:tab w:val="left" w:pos="6412"/>
+          <w:tab w:val="left" w:pos="7328"/>
+          <w:tab w:val="left" w:pos="8244"/>
+          <w:tab w:val="left" w:pos="9160"/>
+          <w:tab w:val="left" w:pos="10076"/>
+          <w:tab w:val="left" w:pos="10992"/>
+          <w:tab w:val="left" w:pos="11908"/>
+          <w:tab w:val="left" w:pos="12824"/>
+          <w:tab w:val="left" w:pos="13740"/>
+          <w:tab w:val="left" w:pos="14656"/>
+        </w:tabs>
+        <w:spacing w:after="0" w:line="240" w:lineRule="auto"/>
+        <w:rPr>
+          <w:rFonts w:ascii="Courier New" w:eastAsia="Times New Roman" w:hAnsi="Courier New" w:cs="Courier New"/>
+          <w:sz w:val="20"/>
+          <w:szCs w:val="20"/>
+          <w:lang w:eastAsia="en-IN" w:bidi="hi-IN"/>
+        </w:rPr>
+      </w:pPr>
+      <w:proofErr w:type="spellStart"/>
+      <w:r>
+        <w:rPr>
+          <w:rFonts w:ascii="Courier New" w:eastAsia="Times New Roman" w:hAnsi="Courier New" w:cs="Courier New"/>
+          <w:sz w:val="20"/>
+          <w:szCs w:val="20"/>
+          <w:lang w:eastAsia="en-IN" w:bidi="hi-IN"/>
+        </w:rPr>
+        <w:t>const</w:t>
+      </w:r>
+      <w:proofErr w:type="spellEnd"/>
+      <w:r>
+        <w:rPr>
+          <w:rFonts w:ascii="Courier New" w:eastAsia="Times New Roman" w:hAnsi="Courier New" w:cs="Courier New"/>
+          <w:sz w:val="20"/>
+          <w:szCs w:val="20"/>
+          <w:lang w:eastAsia="en-IN" w:bidi="hi-IN"/>
+        </w:rPr>
+        <w:t xml:space="preserve"> validation = </w:t>
+      </w:r>
+      <w:proofErr w:type="spellStart"/>
+      <w:r>
+        <w:rPr>
+          <w:rFonts w:ascii="Courier New" w:eastAsia="Times New Roman" w:hAnsi="Courier New" w:cs="Courier New"/>
+          <w:sz w:val="20"/>
+          <w:szCs w:val="20"/>
+          <w:lang w:eastAsia="en-IN" w:bidi="hi-IN"/>
+        </w:rPr>
+        <w:t>noteSchema.safeParse</w:t>
+      </w:r>
+      <w:proofErr w:type="spellEnd"/>
+      <w:r>
+        <w:rPr>
+          <w:rFonts w:ascii="Courier New" w:eastAsia="Times New Roman" w:hAnsi="Courier New" w:cs="Courier New"/>
+          <w:sz w:val="20"/>
+          <w:szCs w:val="20"/>
+          <w:lang w:eastAsia="en-IN" w:bidi="hi-IN"/>
+        </w:rPr>
+        <w:t>(</w:t>
+      </w:r>
+      <w:proofErr w:type="spellStart"/>
+      <w:proofErr w:type="gramStart"/>
+      <w:r>
+        <w:rPr>
+          <w:rFonts w:ascii="Courier New" w:eastAsia="Times New Roman" w:hAnsi="Courier New" w:cs="Courier New"/>
+          <w:sz w:val="20"/>
+          <w:szCs w:val="20"/>
+          <w:lang w:eastAsia="en-IN" w:bidi="hi-IN"/>
+        </w:rPr>
+        <w:t>req.body</w:t>
+      </w:r>
+      <w:proofErr w:type="spellEnd"/>
+      <w:proofErr w:type="gramEnd"/>
+      <w:r>
+        <w:rPr>
+          <w:rFonts w:ascii="Courier New" w:eastAsia="Times New Roman" w:hAnsi="Courier New" w:cs="Courier New"/>
+          <w:sz w:val="20"/>
+          <w:szCs w:val="20"/>
+          <w:lang w:eastAsia="en-IN" w:bidi="hi-IN"/>
+        </w:rPr>
+        <w:t>);</w:t>
+      </w:r>
+    </w:p>
+    <w:p>
+      <w:pPr>
+        <w:tabs>
+          <w:tab w:val="left" w:pos="916"/>
+          <w:tab w:val="left" w:pos="1832"/>
+          <w:tab w:val="left" w:pos="2748"/>
+          <w:tab w:val="left" w:pos="3664"/>
+          <w:tab w:val="left" w:pos="4580"/>
+          <w:tab w:val="left" w:pos="5496"/>
+          <w:tab w:val="left" w:pos="6412"/>
+          <w:tab w:val="left" w:pos="7328"/>
+          <w:tab w:val="left" w:pos="8244"/>
+          <w:tab w:val="left" w:pos="9160"/>
+          <w:tab w:val="left" w:pos="10076"/>
+          <w:tab w:val="left" w:pos="10992"/>
+          <w:tab w:val="left" w:pos="11908"/>
+          <w:tab w:val="left" w:pos="12824"/>
+          <w:tab w:val="left" w:pos="13740"/>
+          <w:tab w:val="left" w:pos="14656"/>
+        </w:tabs>
+        <w:spacing w:after="0" w:line="240" w:lineRule="auto"/>
+        <w:rPr>
+          <w:rFonts w:ascii="Courier New" w:eastAsia="Times New Roman" w:hAnsi="Courier New" w:cs="Courier New"/>
+          <w:sz w:val="20"/>
+          <w:szCs w:val="20"/>
+          <w:lang w:eastAsia="en-IN" w:bidi="hi-IN"/>
+        </w:rPr>
+      </w:pPr>
+    </w:p>
+    <w:p>
+      <w:pPr>
+        <w:tabs>
+          <w:tab w:val="left" w:pos="916"/>
+          <w:tab w:val="left" w:pos="1832"/>
+          <w:tab w:val="left" w:pos="2748"/>
+          <w:tab w:val="left" w:pos="3664"/>
+          <w:tab w:val="left" w:pos="4580"/>
+          <w:tab w:val="left" w:pos="5496"/>
+          <w:tab w:val="left" w:pos="6412"/>
+          <w:tab w:val="left" w:pos="7328"/>
+          <w:tab w:val="left" w:pos="8244"/>
+          <w:tab w:val="left" w:pos="9160"/>
+          <w:tab w:val="left" w:pos="10076"/>
+          <w:tab w:val="left" w:pos="10992"/>
+          <w:tab w:val="left" w:pos="11908"/>
+          <w:tab w:val="left" w:pos="12824"/>
+          <w:tab w:val="left" w:pos="13740"/>
+          <w:tab w:val="left" w:pos="14656"/>
+        </w:tabs>
+        <w:spacing w:after="0" w:line="240" w:lineRule="auto"/>
+        <w:rPr>
+          <w:rFonts w:ascii="Courier New" w:eastAsia="Times New Roman" w:hAnsi="Courier New" w:cs="Courier New"/>
+          <w:sz w:val="20"/>
+          <w:szCs w:val="20"/>
+          <w:lang w:eastAsia="en-IN" w:bidi="hi-IN"/>
+        </w:rPr>
+      </w:pPr>
+      <w:r>
+        <w:rPr>
+          <w:rFonts w:ascii="Courier New" w:eastAsia="Times New Roman" w:hAnsi="Courier New" w:cs="Courier New"/>
+          <w:sz w:val="20"/>
+          <w:szCs w:val="20"/>
+          <w:lang w:eastAsia="en-IN" w:bidi="hi-IN"/>
+        </w:rPr>
+        <w:t xml:space="preserve">if </w:t>
+      </w:r>
+      <w:proofErr w:type="gramStart"/>
+      <w:r>
+        <w:rPr>
+          <w:rFonts w:ascii="Courier New" w:eastAsia="Times New Roman" w:hAnsi="Courier New" w:cs="Courier New"/>
+          <w:sz w:val="20"/>
+          <w:szCs w:val="20"/>
+          <w:lang w:eastAsia="en-IN" w:bidi="hi-IN"/>
+        </w:rPr>
+        <w:t>(!</w:t>
+      </w:r>
+      <w:proofErr w:type="spellStart"/>
+      <w:r>
+        <w:rPr>
+          <w:rFonts w:ascii="Courier New" w:eastAsia="Times New Roman" w:hAnsi="Courier New" w:cs="Courier New"/>
+          <w:sz w:val="20"/>
+          <w:szCs w:val="20"/>
+          <w:lang w:eastAsia="en-IN" w:bidi="hi-IN"/>
+        </w:rPr>
+        <w:t>validation</w:t>
+      </w:r>
+      <w:proofErr w:type="gramEnd"/>
+      <w:r>
+        <w:rPr>
+          <w:rFonts w:ascii="Courier New" w:eastAsia="Times New Roman" w:hAnsi="Courier New" w:cs="Courier New"/>
+          <w:sz w:val="20"/>
+          <w:szCs w:val="20"/>
+          <w:lang w:eastAsia="en-IN" w:bidi="hi-IN"/>
+        </w:rPr>
+        <w:t>.success</w:t>
+      </w:r>
+      <w:proofErr w:type="spellEnd"/>
+      <w:r>
+        <w:rPr>
+          <w:rFonts w:ascii="Courier New" w:eastAsia="Times New Roman" w:hAnsi="Courier New" w:cs="Courier New"/>
+          <w:sz w:val="20"/>
+          <w:szCs w:val="20"/>
+          <w:lang w:eastAsia="en-IN" w:bidi="hi-IN"/>
+        </w:rPr>
+        <w:t>) {</w:t>
+      </w:r>
+    </w:p>
+    <w:p>
+      <w:pPr>
+        <w:tabs>
+          <w:tab w:val="left" w:pos="916"/>
+          <w:tab w:val="left" w:pos="1832"/>
+          <w:tab w:val="left" w:pos="2748"/>
+          <w:tab w:val="left" w:pos="3664"/>
+          <w:tab w:val="left" w:pos="4580"/>
+          <w:tab w:val="left" w:pos="5496"/>
+          <w:tab w:val="left" w:pos="6412"/>
+          <w:tab w:val="left" w:pos="7328"/>
+          <w:tab w:val="left" w:pos="8244"/>
+          <w:tab w:val="left" w:pos="9160"/>
+          <w:tab w:val="left" w:pos="10076"/>
+          <w:tab w:val="left" w:pos="10992"/>
+          <w:tab w:val="left" w:pos="11908"/>
+          <w:tab w:val="left" w:pos="12824"/>
+          <w:tab w:val="left" w:pos="13740"/>
+          <w:tab w:val="left" w:pos="14656"/>
+        </w:tabs>
+        <w:spacing w:after="0" w:line="240" w:lineRule="auto"/>
+        <w:rPr>
+          <w:rFonts w:ascii="Courier New" w:eastAsia="Times New Roman" w:hAnsi="Courier New" w:cs="Courier New"/>
+          <w:sz w:val="20"/>
+          <w:szCs w:val="20"/>
+          <w:lang w:eastAsia="en-IN" w:bidi="hi-IN"/>
+        </w:rPr>
+      </w:pPr>
+      <w:r>
+        <w:rPr>
+          <w:rFonts w:ascii="Courier New" w:eastAsia="Times New Roman" w:hAnsi="Courier New" w:cs="Courier New"/>
+          <w:sz w:val="20"/>
+          <w:szCs w:val="20"/>
+          <w:lang w:eastAsia="en-IN" w:bidi="hi-IN"/>
+        </w:rPr>
+        <w:t xml:space="preserve">  return </w:t>
+      </w:r>
+      <w:proofErr w:type="spellStart"/>
+      <w:proofErr w:type="gramStart"/>
+      <w:r>
+        <w:rPr>
+          <w:rFonts w:ascii="Courier New" w:eastAsia="Times New Roman" w:hAnsi="Courier New" w:cs="Courier New"/>
+          <w:sz w:val="20"/>
+          <w:szCs w:val="20"/>
+          <w:lang w:eastAsia="en-IN" w:bidi="hi-IN"/>
+        </w:rPr>
+        <w:t>res.status</w:t>
+      </w:r>
+      <w:proofErr w:type="spellEnd"/>
+      <w:proofErr w:type="gramEnd"/>
+      <w:r>
+        <w:rPr>
+          <w:rFonts w:ascii="Courier New" w:eastAsia="Times New Roman" w:hAnsi="Courier New" w:cs="Courier New"/>
+          <w:sz w:val="20"/>
+          <w:szCs w:val="20"/>
+          <w:lang w:eastAsia="en-IN" w:bidi="hi-IN"/>
+        </w:rPr>
+        <w:t>(400).</w:t>
+      </w:r>
+      <w:proofErr w:type="spellStart"/>
+      <w:r>
+        <w:rPr>
+          <w:rFonts w:ascii="Courier New" w:eastAsia="Times New Roman" w:hAnsi="Courier New" w:cs="Courier New"/>
+          <w:sz w:val="20"/>
+          <w:szCs w:val="20"/>
+          <w:lang w:eastAsia="en-IN" w:bidi="hi-IN"/>
+        </w:rPr>
+        <w:t>json</w:t>
+      </w:r>
+      <w:proofErr w:type="spellEnd"/>
+      <w:r>
+        <w:rPr>
+          <w:rFonts w:ascii="Courier New" w:eastAsia="Times New Roman" w:hAnsi="Courier New" w:cs="Courier New"/>
+          <w:sz w:val="20"/>
+          <w:szCs w:val="20"/>
+          <w:lang w:eastAsia="en-IN" w:bidi="hi-IN"/>
+        </w:rPr>
+        <w:t xml:space="preserve">({ error: </w:t>
+      </w:r>
+      <w:proofErr w:type="spellStart"/>
+      <w:r>
+        <w:rPr>
+          <w:rFonts w:ascii="Courier New" w:eastAsia="Times New Roman" w:hAnsi="Courier New" w:cs="Courier New"/>
+          <w:sz w:val="20"/>
+          <w:szCs w:val="20"/>
+          <w:lang w:eastAsia="en-IN" w:bidi="hi-IN"/>
+        </w:rPr>
+        <w:t>validation.error.errors</w:t>
+      </w:r>
+      <w:proofErr w:type="spellEnd"/>
+      <w:r>
+        <w:rPr>
+          <w:rFonts w:ascii="Courier New" w:eastAsia="Times New Roman" w:hAnsi="Courier New" w:cs="Courier New"/>
+          <w:sz w:val="20"/>
+          <w:szCs w:val="20"/>
+          <w:lang w:eastAsia="en-IN" w:bidi="hi-IN"/>
+        </w:rPr>
+        <w:t xml:space="preserve"> });</w:t>
+      </w:r>
+    </w:p>
+    <w:p>
+      <w:pPr>
+        <w:tabs>
+          <w:tab w:val="left" w:pos="916"/>
+          <w:tab w:val="left" w:pos="1832"/>
+          <w:tab w:val="left" w:pos="2748"/>
+          <w:tab w:val="left" w:pos="3664"/>
+          <w:tab w:val="left" w:pos="4580"/>
+          <w:tab w:val="left" w:pos="5496"/>
+          <w:tab w:val="left" w:pos="6412"/>
+          <w:tab w:val="left" w:pos="7328"/>
+          <w:tab w:val="left" w:pos="8244"/>
+          <w:tab w:val="left" w:pos="9160"/>
+          <w:tab w:val="left" w:pos="10076"/>
+          <w:tab w:val="left" w:pos="10992"/>
+          <w:tab w:val="left" w:pos="11908"/>
+          <w:tab w:val="left" w:pos="12824"/>
+          <w:tab w:val="left" w:pos="13740"/>
+          <w:tab w:val="left" w:pos="14656"/>
+        </w:tabs>
+        <w:spacing w:after="0" w:line="240" w:lineRule="auto"/>
+        <w:rPr>
+          <w:rFonts w:ascii="Courier New" w:eastAsia="Times New Roman" w:hAnsi="Courier New" w:cs="Courier New"/>
+          <w:sz w:val="20"/>
+          <w:szCs w:val="20"/>
+          <w:lang w:eastAsia="en-IN" w:bidi="hi-IN"/>
+        </w:rPr>
+      </w:pPr>
+      <w:r>
+        <w:rPr>
+          <w:rFonts w:ascii="Courier New" w:eastAsia="Times New Roman" w:hAnsi="Courier New" w:cs="Courier New"/>
+          <w:sz w:val="20"/>
+          <w:szCs w:val="20"/>
+          <w:lang w:eastAsia="en-IN" w:bidi="hi-IN"/>
+        </w:rPr>
+        <w:t>}</w:t>
+      </w:r>
+    </w:p>
+    <w:p>
+      <w:pPr>
+        <w:spacing w:after="0" w:line="240" w:lineRule="auto"/>
+        <w:rPr>
+          <w:rFonts w:ascii="Times New Roman" w:eastAsia="Times New Roman" w:hAnsi="Times New Roman" w:cs="Times New Roman"/>
+          <w:sz w:val="24"/>
+          <w:szCs w:val="24"/>
+          <w:lang w:eastAsia="en-IN" w:bidi="hi-IN"/>
+        </w:rPr>
+      </w:pPr>
+      <w:r>
+        <w:rPr>
+          <w:rFonts w:ascii="Times New Roman" w:eastAsia="Times New Roman" w:hAnsi="Times New Roman" w:cs="Times New Roman"/>
+          <w:sz w:val="24"/>
+          <w:szCs w:val="24"/>
+          <w:lang w:eastAsia="en-IN" w:bidi="hi-IN"/>
+        </w:rPr>
         <w:pict>
-          <v:rect id="_x0000_i1070" style="width:0;height:1.5pt" o:hralign="center" o:hrstd="t" o:hr="t" fillcolor="#a0a0a0" stroked="f"/>
+          <v:rect id="_x0000_i1089" style="width:0;height:1.5pt" o:hralign="center" o:hrstd="t" o:hr="t" fillcolor="#a0a0a0" stroked="f"/>
         </w:pict>
       </w:r>
     </w:p>
     <w:p>
       <w:pPr>
-        <w:pStyle w:val="NormalWeb"/>
-      </w:pPr>
-      <w:r>
-        <w:t xml:space="preserve">If you want, I can take you to </w:t>
-      </w:r>
-      <w:r>
-        <w:rPr>
-          <w:rStyle w:val="Strong"/>
-        </w:rPr>
-        <w:t>next level immediately</w:t>
-      </w:r>
-      <w:r>
-        <w:t>:</w:t>
+        <w:spacing w:before="100" w:beforeAutospacing="1" w:after="100" w:afterAutospacing="1" w:line="240" w:lineRule="auto"/>
+        <w:outlineLvl w:val="1"/>
+        <w:rPr>
+          <w:rFonts w:ascii="Times New Roman" w:eastAsia="Times New Roman" w:hAnsi="Times New Roman" w:cs="Times New Roman"/>
+          <w:b/>
+          <w:bCs/>
+          <w:sz w:val="36"/>
+          <w:szCs w:val="36"/>
+          <w:lang w:eastAsia="en-IN" w:bidi="hi-IN"/>
+        </w:rPr>
+      </w:pPr>
+      <w:r>
+        <w:rPr>
+          <w:rFonts w:ascii="Segoe UI Symbol" w:eastAsia="Times New Roman" w:hAnsi="Segoe UI Symbol" w:cs="Segoe UI Symbol"/>
+          <w:b/>
+          <w:bCs/>
+          <w:sz w:val="36"/>
+          <w:szCs w:val="36"/>
+          <w:lang w:eastAsia="en-IN" w:bidi="hi-IN"/>
+        </w:rPr>
+        <w:t>🚀</w:t>
+      </w:r>
+      <w:r>
+        <w:rPr>
+          <w:rFonts w:ascii="Times New Roman" w:eastAsia="Times New Roman" w:hAnsi="Times New Roman" w:cs="Times New Roman"/>
+          <w:b/>
+          <w:bCs/>
+          <w:sz w:val="36"/>
+          <w:szCs w:val="36"/>
+          <w:lang w:eastAsia="en-IN" w:bidi="hi-IN"/>
+        </w:rPr>
+        <w:t xml:space="preserve"> Try this (to see validation in action)</w:t>
+      </w:r>
+    </w:p>
+    <w:p>
+      <w:pPr>
+        <w:spacing w:before="100" w:beforeAutospacing="1" w:after="100" w:afterAutospacing="1" w:line="240" w:lineRule="auto"/>
+        <w:outlineLvl w:val="2"/>
+        <w:rPr>
+          <w:rFonts w:ascii="Times New Roman" w:eastAsia="Times New Roman" w:hAnsi="Times New Roman" w:cs="Times New Roman"/>
+          <w:b/>
+          <w:bCs/>
+          <w:sz w:val="27"/>
+          <w:szCs w:val="27"/>
+          <w:lang w:eastAsia="en-IN" w:bidi="hi-IN"/>
+        </w:rPr>
+      </w:pPr>
+      <w:r>
+        <w:rPr>
+          <w:rFonts w:ascii="Segoe UI Symbol" w:eastAsia="Times New Roman" w:hAnsi="Segoe UI Symbol" w:cs="Segoe UI Symbol"/>
+          <w:b/>
+          <w:bCs/>
+          <w:sz w:val="27"/>
+          <w:szCs w:val="27"/>
+          <w:lang w:eastAsia="en-IN" w:bidi="hi-IN"/>
+        </w:rPr>
+        <w:t>❌</w:t>
+      </w:r>
+      <w:r>
+        <w:rPr>
+          <w:rFonts w:ascii="Times New Roman" w:eastAsia="Times New Roman" w:hAnsi="Times New Roman" w:cs="Times New Roman"/>
+          <w:b/>
+          <w:bCs/>
+          <w:sz w:val="27"/>
+          <w:szCs w:val="27"/>
+          <w:lang w:eastAsia="en-IN" w:bidi="hi-IN"/>
+        </w:rPr>
+        <w:t xml:space="preserve"> Invalid request</w:t>
+      </w:r>
+    </w:p>
+    <w:p>
+      <w:pPr>
+        <w:tabs>
+          <w:tab w:val="left" w:pos="916"/>
+          <w:tab w:val="left" w:pos="1832"/>
+          <w:tab w:val="left" w:pos="2748"/>
+          <w:tab w:val="left" w:pos="3664"/>
+          <w:tab w:val="left" w:pos="4580"/>
+          <w:tab w:val="left" w:pos="5496"/>
+          <w:tab w:val="left" w:pos="6412"/>
+          <w:tab w:val="left" w:pos="7328"/>
+          <w:tab w:val="left" w:pos="8244"/>
+          <w:tab w:val="left" w:pos="9160"/>
+          <w:tab w:val="left" w:pos="10076"/>
+          <w:tab w:val="left" w:pos="10992"/>
+          <w:tab w:val="left" w:pos="11908"/>
+          <w:tab w:val="left" w:pos="12824"/>
+          <w:tab w:val="left" w:pos="13740"/>
+          <w:tab w:val="left" w:pos="14656"/>
+        </w:tabs>
+        <w:spacing w:after="0" w:line="240" w:lineRule="auto"/>
+        <w:rPr>
+          <w:rFonts w:ascii="Courier New" w:eastAsia="Times New Roman" w:hAnsi="Courier New" w:cs="Courier New"/>
+          <w:sz w:val="20"/>
+          <w:szCs w:val="20"/>
+          <w:lang w:eastAsia="en-IN" w:bidi="hi-IN"/>
+        </w:rPr>
+      </w:pPr>
+      <w:r>
+        <w:rPr>
+          <w:rFonts w:ascii="Courier New" w:eastAsia="Times New Roman" w:hAnsi="Courier New" w:cs="Courier New"/>
+          <w:sz w:val="20"/>
+          <w:szCs w:val="20"/>
+          <w:lang w:eastAsia="en-IN" w:bidi="hi-IN"/>
+        </w:rPr>
+        <w:t>POST /notes</w:t>
+      </w:r>
+    </w:p>
+    <w:p>
+      <w:pPr>
+        <w:tabs>
+          <w:tab w:val="left" w:pos="916"/>
+          <w:tab w:val="left" w:pos="1832"/>
+          <w:tab w:val="left" w:pos="2748"/>
+          <w:tab w:val="left" w:pos="3664"/>
+          <w:tab w:val="left" w:pos="4580"/>
+          <w:tab w:val="left" w:pos="5496"/>
+          <w:tab w:val="left" w:pos="6412"/>
+          <w:tab w:val="left" w:pos="7328"/>
+          <w:tab w:val="left" w:pos="8244"/>
+          <w:tab w:val="left" w:pos="9160"/>
+          <w:tab w:val="left" w:pos="10076"/>
+          <w:tab w:val="left" w:pos="10992"/>
+          <w:tab w:val="left" w:pos="11908"/>
+          <w:tab w:val="left" w:pos="12824"/>
+          <w:tab w:val="left" w:pos="13740"/>
+          <w:tab w:val="left" w:pos="14656"/>
+        </w:tabs>
+        <w:spacing w:after="0" w:line="240" w:lineRule="auto"/>
+        <w:rPr>
+          <w:rFonts w:ascii="Courier New" w:eastAsia="Times New Roman" w:hAnsi="Courier New" w:cs="Courier New"/>
+          <w:sz w:val="20"/>
+          <w:szCs w:val="20"/>
+          <w:lang w:eastAsia="en-IN" w:bidi="hi-IN"/>
+        </w:rPr>
+      </w:pPr>
+      <w:r>
+        <w:rPr>
+          <w:rFonts w:ascii="Courier New" w:eastAsia="Times New Roman" w:hAnsi="Courier New" w:cs="Courier New"/>
+          <w:sz w:val="20"/>
+          <w:szCs w:val="20"/>
+          <w:lang w:eastAsia="en-IN" w:bidi="hi-IN"/>
+        </w:rPr>
+        <w:t>{</w:t>
+      </w:r>
+    </w:p>
+    <w:p>
+      <w:pPr>
+        <w:tabs>
+          <w:tab w:val="left" w:pos="916"/>
+          <w:tab w:val="left" w:pos="1832"/>
+          <w:tab w:val="left" w:pos="2748"/>
+          <w:tab w:val="left" w:pos="3664"/>
+          <w:tab w:val="left" w:pos="4580"/>
+          <w:tab w:val="left" w:pos="5496"/>
+          <w:tab w:val="left" w:pos="6412"/>
+          <w:tab w:val="left" w:pos="7328"/>
+          <w:tab w:val="left" w:pos="8244"/>
+          <w:tab w:val="left" w:pos="9160"/>
+          <w:tab w:val="left" w:pos="10076"/>
+          <w:tab w:val="left" w:pos="10992"/>
+          <w:tab w:val="left" w:pos="11908"/>
+          <w:tab w:val="left" w:pos="12824"/>
+          <w:tab w:val="left" w:pos="13740"/>
+          <w:tab w:val="left" w:pos="14656"/>
+        </w:tabs>
+        <w:spacing w:after="0" w:line="240" w:lineRule="auto"/>
+        <w:rPr>
+          <w:rFonts w:ascii="Courier New" w:eastAsia="Times New Roman" w:hAnsi="Courier New" w:cs="Courier New"/>
+          <w:sz w:val="20"/>
+          <w:szCs w:val="20"/>
+          <w:lang w:eastAsia="en-IN" w:bidi="hi-IN"/>
+        </w:rPr>
+      </w:pPr>
+      <w:r>
+        <w:rPr>
+          <w:rFonts w:ascii="Courier New" w:eastAsia="Times New Roman" w:hAnsi="Courier New" w:cs="Courier New"/>
+          <w:sz w:val="20"/>
+          <w:szCs w:val="20"/>
+          <w:lang w:eastAsia="en-IN" w:bidi="hi-IN"/>
+        </w:rPr>
+        <w:t xml:space="preserve">  "title": "",</w:t>
+      </w:r>
+    </w:p>
+    <w:p>
+      <w:pPr>
+        <w:tabs>
+          <w:tab w:val="left" w:pos="916"/>
+          <w:tab w:val="left" w:pos="1832"/>
+          <w:tab w:val="left" w:pos="2748"/>
+          <w:tab w:val="left" w:pos="3664"/>
+          <w:tab w:val="left" w:pos="4580"/>
+          <w:tab w:val="left" w:pos="5496"/>
+          <w:tab w:val="left" w:pos="6412"/>
+          <w:tab w:val="left" w:pos="7328"/>
+          <w:tab w:val="left" w:pos="8244"/>
+          <w:tab w:val="left" w:pos="9160"/>
+          <w:tab w:val="left" w:pos="10076"/>
+          <w:tab w:val="left" w:pos="10992"/>
+          <w:tab w:val="left" w:pos="11908"/>
+          <w:tab w:val="left" w:pos="12824"/>
+          <w:tab w:val="left" w:pos="13740"/>
+          <w:tab w:val="left" w:pos="14656"/>
+        </w:tabs>
+        <w:spacing w:after="0" w:line="240" w:lineRule="auto"/>
+        <w:rPr>
+          <w:rFonts w:ascii="Courier New" w:eastAsia="Times New Roman" w:hAnsi="Courier New" w:cs="Courier New"/>
+          <w:sz w:val="20"/>
+          <w:szCs w:val="20"/>
+          <w:lang w:eastAsia="en-IN" w:bidi="hi-IN"/>
+        </w:rPr>
+      </w:pPr>
+      <w:r>
+        <w:rPr>
+          <w:rFonts w:ascii="Courier New" w:eastAsia="Times New Roman" w:hAnsi="Courier New" w:cs="Courier New"/>
+          <w:sz w:val="20"/>
+          <w:szCs w:val="20"/>
+          <w:lang w:eastAsia="en-IN" w:bidi="hi-IN"/>
+        </w:rPr>
+        <w:t xml:space="preserve">  "content": ""</w:t>
+      </w:r>
+    </w:p>
+    <w:p>
+      <w:pPr>
+        <w:tabs>
+          <w:tab w:val="left" w:pos="916"/>
+          <w:tab w:val="left" w:pos="1832"/>
+          <w:tab w:val="left" w:pos="2748"/>
+          <w:tab w:val="left" w:pos="3664"/>
+          <w:tab w:val="left" w:pos="4580"/>
+          <w:tab w:val="left" w:pos="5496"/>
+          <w:tab w:val="left" w:pos="6412"/>
+          <w:tab w:val="left" w:pos="7328"/>
+          <w:tab w:val="left" w:pos="8244"/>
+          <w:tab w:val="left" w:pos="9160"/>
+          <w:tab w:val="left" w:pos="10076"/>
+          <w:tab w:val="left" w:pos="10992"/>
+          <w:tab w:val="left" w:pos="11908"/>
+          <w:tab w:val="left" w:pos="12824"/>
+          <w:tab w:val="left" w:pos="13740"/>
+          <w:tab w:val="left" w:pos="14656"/>
+        </w:tabs>
+        <w:spacing w:after="0" w:line="240" w:lineRule="auto"/>
+        <w:rPr>
+          <w:rFonts w:ascii="Courier New" w:eastAsia="Times New Roman" w:hAnsi="Courier New" w:cs="Courier New"/>
+          <w:sz w:val="20"/>
+          <w:szCs w:val="20"/>
+          <w:lang w:eastAsia="en-IN" w:bidi="hi-IN"/>
+        </w:rPr>
+      </w:pPr>
+      <w:r>
+        <w:rPr>
+          <w:rFonts w:ascii="Courier New" w:eastAsia="Times New Roman" w:hAnsi="Courier New" w:cs="Courier New"/>
+          <w:sz w:val="20"/>
+          <w:szCs w:val="20"/>
+          <w:lang w:eastAsia="en-IN" w:bidi="hi-IN"/>
+        </w:rPr>
+        <w:t>}</w:t>
+      </w:r>
+    </w:p>
+    <w:p>
+      <w:pPr>
+        <w:spacing w:before="100" w:beforeAutospacing="1" w:after="100" w:afterAutospacing="1" w:line="240" w:lineRule="auto"/>
+        <w:rPr>
+          <w:rFonts w:ascii="Times New Roman" w:eastAsia="Times New Roman" w:hAnsi="Times New Roman" w:cs="Times New Roman"/>
+          <w:sz w:val="24"/>
+          <w:szCs w:val="24"/>
+          <w:lang w:eastAsia="en-IN" w:bidi="hi-IN"/>
+        </w:rPr>
+      </w:pPr>
+      <w:r>
+        <w:rPr>
+          <w:rFonts w:ascii="Segoe UI Symbol" w:eastAsia="Times New Roman" w:hAnsi="Segoe UI Symbol" w:cs="Segoe UI Symbol"/>
+          <w:sz w:val="24"/>
+          <w:szCs w:val="24"/>
+          <w:lang w:eastAsia="en-IN" w:bidi="hi-IN"/>
+        </w:rPr>
+        <w:t>👉</w:t>
+      </w:r>
+      <w:r>
+        <w:rPr>
+          <w:rFonts w:ascii="Times New Roman" w:eastAsia="Times New Roman" w:hAnsi="Times New Roman" w:cs="Times New Roman"/>
+          <w:sz w:val="24"/>
+          <w:szCs w:val="24"/>
+          <w:lang w:eastAsia="en-IN" w:bidi="hi-IN"/>
+        </w:rPr>
+        <w:t xml:space="preserve"> You’ll get proper error response instead of bad data</w:t>
+      </w:r>
+    </w:p>
+    <w:p>
+      <w:pPr>
+        <w:spacing w:after="0" w:line="240" w:lineRule="auto"/>
+        <w:rPr>
+          <w:rFonts w:ascii="Times New Roman" w:eastAsia="Times New Roman" w:hAnsi="Times New Roman" w:cs="Times New Roman"/>
+          <w:sz w:val="24"/>
+          <w:szCs w:val="24"/>
+          <w:lang w:eastAsia="en-IN" w:bidi="hi-IN"/>
+        </w:rPr>
+      </w:pPr>
+      <w:r>
+        <w:rPr>
+          <w:rFonts w:ascii="Times New Roman" w:eastAsia="Times New Roman" w:hAnsi="Times New Roman" w:cs="Times New Roman"/>
+          <w:sz w:val="24"/>
+          <w:szCs w:val="24"/>
+          <w:lang w:eastAsia="en-IN" w:bidi="hi-IN"/>
+        </w:rPr>
+        <w:pict>
+          <v:rect id="_x0000_i1090" style="width:0;height:1.5pt" o:hralign="center" o:hrstd="t" o:hr="t" fillcolor="#a0a0a0" stroked="f"/>
+        </w:pict>
+      </w:r>
+    </w:p>
+    <w:p>
+      <w:pPr>
+        <w:spacing w:before="100" w:beforeAutospacing="1" w:after="100" w:afterAutospacing="1" w:line="240" w:lineRule="auto"/>
+        <w:outlineLvl w:val="1"/>
+        <w:rPr>
+          <w:rFonts w:ascii="Times New Roman" w:eastAsia="Times New Roman" w:hAnsi="Times New Roman" w:cs="Times New Roman"/>
+          <w:b/>
+          <w:bCs/>
+          <w:sz w:val="36"/>
+          <w:szCs w:val="36"/>
+          <w:lang w:eastAsia="en-IN" w:bidi="hi-IN"/>
+        </w:rPr>
+      </w:pPr>
+      <w:r>
+        <w:rPr>
+          <w:rFonts w:ascii="Segoe UI Symbol" w:eastAsia="Times New Roman" w:hAnsi="Segoe UI Symbol" w:cs="Segoe UI Symbol"/>
+          <w:b/>
+          <w:bCs/>
+          <w:sz w:val="36"/>
+          <w:szCs w:val="36"/>
+          <w:lang w:eastAsia="en-IN" w:bidi="hi-IN"/>
+        </w:rPr>
+        <w:t>⚠️</w:t>
+      </w:r>
+      <w:r>
+        <w:rPr>
+          <w:rFonts w:ascii="Times New Roman" w:eastAsia="Times New Roman" w:hAnsi="Times New Roman" w:cs="Times New Roman"/>
+          <w:b/>
+          <w:bCs/>
+          <w:sz w:val="36"/>
+          <w:szCs w:val="36"/>
+          <w:lang w:eastAsia="en-IN" w:bidi="hi-IN"/>
+        </w:rPr>
+        <w:t xml:space="preserve"> Why this matters (interview level)</w:t>
+      </w:r>
+    </w:p>
+    <w:p>
+      <w:pPr>
+        <w:spacing w:before="100" w:beforeAutospacing="1" w:after="100" w:afterAutospacing="1" w:line="240" w:lineRule="auto"/>
+        <w:rPr>
+          <w:rFonts w:ascii="Times New Roman" w:eastAsia="Times New Roman" w:hAnsi="Times New Roman" w:cs="Times New Roman"/>
+          <w:sz w:val="24"/>
+          <w:szCs w:val="24"/>
+          <w:lang w:eastAsia="en-IN" w:bidi="hi-IN"/>
+        </w:rPr>
+      </w:pPr>
+      <w:r>
+        <w:rPr>
+          <w:rFonts w:ascii="Times New Roman" w:eastAsia="Times New Roman" w:hAnsi="Times New Roman" w:cs="Times New Roman"/>
+          <w:sz w:val="24"/>
+          <w:szCs w:val="24"/>
+          <w:lang w:eastAsia="en-IN" w:bidi="hi-IN"/>
+        </w:rPr>
+        <w:t>Without validation:</w:t>
       </w:r>
     </w:p>
     <w:p>
       <w:pPr>
         <w:numPr>
           <w:ilvl w:val="0"/>
-          <w:numId w:val="23"/>
+          <w:numId w:val="25"/>
         </w:numPr>
         <w:spacing w:before="100" w:beforeAutospacing="1" w:after="100" w:afterAutospacing="1" w:line="240" w:lineRule="auto"/>
-      </w:pPr>
-      <w:r>
-        <w:rPr>
-          <w:rFonts w:ascii="Segoe UI Symbol" w:hAnsi="Segoe UI Symbol" w:cs="Segoe UI Symbol"/>
-        </w:rPr>
-        <w:t>💣</w:t>
-      </w:r>
-      <w:r>
-        <w:t xml:space="preserve"> Convert this into </w:t>
-      </w:r>
-      <w:r>
-        <w:rPr>
-          <w:rStyle w:val="Strong"/>
-        </w:rPr>
-        <w:t>MongoDB production backend</w:t>
-      </w:r>
-      <w:r>
-        <w:t xml:space="preserve"> </w:t>
+        <w:rPr>
+          <w:rFonts w:ascii="Times New Roman" w:eastAsia="Times New Roman" w:hAnsi="Times New Roman" w:cs="Times New Roman"/>
+          <w:sz w:val="24"/>
+          <w:szCs w:val="24"/>
+          <w:lang w:eastAsia="en-IN" w:bidi="hi-IN"/>
+        </w:rPr>
+      </w:pPr>
+      <w:r>
+        <w:rPr>
+          <w:rFonts w:ascii="Times New Roman" w:eastAsia="Times New Roman" w:hAnsi="Times New Roman" w:cs="Times New Roman"/>
+          <w:sz w:val="24"/>
+          <w:szCs w:val="24"/>
+          <w:lang w:eastAsia="en-IN" w:bidi="hi-IN"/>
+        </w:rPr>
+        <w:t xml:space="preserve">Your API is </w:t>
+      </w:r>
+      <w:r>
+        <w:rPr>
+          <w:rFonts w:ascii="Times New Roman" w:eastAsia="Times New Roman" w:hAnsi="Times New Roman" w:cs="Times New Roman"/>
+          <w:b/>
+          <w:bCs/>
+          <w:sz w:val="24"/>
+          <w:szCs w:val="24"/>
+          <w:lang w:eastAsia="en-IN" w:bidi="hi-IN"/>
+        </w:rPr>
+        <w:t>unsafe</w:t>
       </w:r>
     </w:p>
     <w:p>
       <w:pPr>
         <w:numPr>
           <w:ilvl w:val="0"/>
-          <w:numId w:val="23"/>
+          <w:numId w:val="25"/>
         </w:numPr>
         <w:spacing w:before="100" w:beforeAutospacing="1" w:after="100" w:afterAutospacing="1" w:line="240" w:lineRule="auto"/>
-      </w:pPr>
-      <w:r>
-        <w:rPr>
-          <w:rFonts w:ascii="Segoe UI Symbol" w:hAnsi="Segoe UI Symbol" w:cs="Segoe UI Symbol"/>
-        </w:rPr>
-        <w:t>🔐</w:t>
-      </w:r>
-      <w:r>
-        <w:t xml:space="preserve"> Add </w:t>
-      </w:r>
-      <w:r>
-        <w:rPr>
-          <w:rStyle w:val="Strong"/>
-        </w:rPr>
-        <w:t xml:space="preserve">Login/Register + JWT </w:t>
-      </w:r>
-      <w:proofErr w:type="spellStart"/>
-      <w:r>
-        <w:rPr>
-          <w:rStyle w:val="Strong"/>
-        </w:rPr>
-        <w:t>auth</w:t>
-      </w:r>
-      <w:proofErr w:type="spellEnd"/>
-      <w:r>
-        <w:t xml:space="preserve"> </w:t>
+        <w:rPr>
+          <w:rFonts w:ascii="Times New Roman" w:eastAsia="Times New Roman" w:hAnsi="Times New Roman" w:cs="Times New Roman"/>
+          <w:sz w:val="24"/>
+          <w:szCs w:val="24"/>
+          <w:lang w:eastAsia="en-IN" w:bidi="hi-IN"/>
+        </w:rPr>
+      </w:pPr>
+      <w:r>
+        <w:rPr>
+          <w:rFonts w:ascii="Times New Roman" w:eastAsia="Times New Roman" w:hAnsi="Times New Roman" w:cs="Times New Roman"/>
+          <w:sz w:val="24"/>
+          <w:szCs w:val="24"/>
+          <w:lang w:eastAsia="en-IN" w:bidi="hi-IN"/>
+        </w:rPr>
+        <w:t>Bad data corrupts system</w:t>
+      </w:r>
+    </w:p>
+    <w:p>
+      <w:pPr>
+        <w:spacing w:before="100" w:beforeAutospacing="1" w:after="100" w:afterAutospacing="1" w:line="240" w:lineRule="auto"/>
+        <w:rPr>
+          <w:rFonts w:ascii="Times New Roman" w:eastAsia="Times New Roman" w:hAnsi="Times New Roman" w:cs="Times New Roman"/>
+          <w:sz w:val="24"/>
+          <w:szCs w:val="24"/>
+          <w:lang w:eastAsia="en-IN" w:bidi="hi-IN"/>
+        </w:rPr>
+      </w:pPr>
+      <w:r>
+        <w:rPr>
+          <w:rFonts w:ascii="Times New Roman" w:eastAsia="Times New Roman" w:hAnsi="Times New Roman" w:cs="Times New Roman"/>
+          <w:sz w:val="24"/>
+          <w:szCs w:val="24"/>
+          <w:lang w:eastAsia="en-IN" w:bidi="hi-IN"/>
+        </w:rPr>
+        <w:t xml:space="preserve">With </w:t>
+      </w:r>
+      <w:proofErr w:type="spellStart"/>
+      <w:r>
+        <w:rPr>
+          <w:rFonts w:ascii="Times New Roman" w:eastAsia="Times New Roman" w:hAnsi="Times New Roman" w:cs="Times New Roman"/>
+          <w:sz w:val="24"/>
+          <w:szCs w:val="24"/>
+          <w:lang w:eastAsia="en-IN" w:bidi="hi-IN"/>
+        </w:rPr>
+        <w:t>Zod</w:t>
+      </w:r>
+      <w:proofErr w:type="spellEnd"/>
+      <w:r>
+        <w:rPr>
+          <w:rFonts w:ascii="Times New Roman" w:eastAsia="Times New Roman" w:hAnsi="Times New Roman" w:cs="Times New Roman"/>
+          <w:sz w:val="24"/>
+          <w:szCs w:val="24"/>
+          <w:lang w:eastAsia="en-IN" w:bidi="hi-IN"/>
+        </w:rPr>
+        <w:t>:</w:t>
       </w:r>
     </w:p>
     <w:p>
       <w:pPr>
         <w:numPr>
           <w:ilvl w:val="0"/>
-          <w:numId w:val="23"/>
+          <w:numId w:val="26"/>
         </w:numPr>
         <w:spacing w:before="100" w:beforeAutospacing="1" w:after="100" w:afterAutospacing="1" w:line="240" w:lineRule="auto"/>
-      </w:pPr>
-      <w:r>
-        <w:rPr>
-          <w:rFonts w:ascii="Calibri" w:hAnsi="Calibri" w:cs="Calibri"/>
-        </w:rPr>
-        <w:t>🧪</w:t>
-      </w:r>
-      <w:r>
-        <w:t xml:space="preserve"> Add </w:t>
-      </w:r>
-      <w:r>
-        <w:rPr>
-          <w:rStyle w:val="Strong"/>
-        </w:rPr>
-        <w:t>Mocha/Chai tests for API</w:t>
+        <w:rPr>
+          <w:rFonts w:ascii="Times New Roman" w:eastAsia="Times New Roman" w:hAnsi="Times New Roman" w:cs="Times New Roman"/>
+          <w:sz w:val="24"/>
+          <w:szCs w:val="24"/>
+          <w:lang w:eastAsia="en-IN" w:bidi="hi-IN"/>
+        </w:rPr>
+      </w:pPr>
+      <w:r>
+        <w:rPr>
+          <w:rFonts w:ascii="Times New Roman" w:eastAsia="Times New Roman" w:hAnsi="Times New Roman" w:cs="Times New Roman"/>
+          <w:sz w:val="24"/>
+          <w:szCs w:val="24"/>
+          <w:lang w:eastAsia="en-IN" w:bidi="hi-IN"/>
+        </w:rPr>
+        <w:t>Type-safe</w:t>
+      </w:r>
+    </w:p>
+    <w:p>
+      <w:pPr>
+        <w:numPr>
+          <w:ilvl w:val="0"/>
+          <w:numId w:val="26"/>
+        </w:numPr>
+        <w:spacing w:before="100" w:beforeAutospacing="1" w:after="100" w:afterAutospacing="1" w:line="240" w:lineRule="auto"/>
+        <w:rPr>
+          <w:rFonts w:ascii="Times New Roman" w:eastAsia="Times New Roman" w:hAnsi="Times New Roman" w:cs="Times New Roman"/>
+          <w:sz w:val="24"/>
+          <w:szCs w:val="24"/>
+          <w:lang w:eastAsia="en-IN" w:bidi="hi-IN"/>
+        </w:rPr>
+      </w:pPr>
+      <w:r>
+        <w:rPr>
+          <w:rFonts w:ascii="Times New Roman" w:eastAsia="Times New Roman" w:hAnsi="Times New Roman" w:cs="Times New Roman"/>
+          <w:sz w:val="24"/>
+          <w:szCs w:val="24"/>
+          <w:lang w:eastAsia="en-IN" w:bidi="hi-IN"/>
+        </w:rPr>
+        <w:t>Clean error handling</w:t>
+      </w:r>
+    </w:p>
+    <w:p>
+      <w:pPr>
+        <w:numPr>
+          <w:ilvl w:val="0"/>
+          <w:numId w:val="26"/>
+        </w:numPr>
+        <w:spacing w:before="100" w:beforeAutospacing="1" w:after="100" w:afterAutospacing="1" w:line="240" w:lineRule="auto"/>
+        <w:rPr>
+          <w:rFonts w:ascii="Times New Roman" w:eastAsia="Times New Roman" w:hAnsi="Times New Roman" w:cs="Times New Roman"/>
+          <w:sz w:val="24"/>
+          <w:szCs w:val="24"/>
+          <w:lang w:eastAsia="en-IN" w:bidi="hi-IN"/>
+        </w:rPr>
+      </w:pPr>
+      <w:r>
+        <w:rPr>
+          <w:rFonts w:ascii="Times New Roman" w:eastAsia="Times New Roman" w:hAnsi="Times New Roman" w:cs="Times New Roman"/>
+          <w:sz w:val="24"/>
+          <w:szCs w:val="24"/>
+          <w:lang w:eastAsia="en-IN" w:bidi="hi-IN"/>
+        </w:rPr>
+        <w:lastRenderedPageBreak/>
+        <w:t>Industry-standard approach</w:t>
       </w:r>
     </w:p>
     <w:p/>
@@ -3807,6 +4748,155 @@
     </w:lvl>
   </w:abstractNum>
   <w:abstractNum w:abstractNumId="6" w15:restartNumberingAfterBreak="0">
+    <w:nsid w:val="1FF23DC4"/>
+    <w:multiLevelType w:val="multilevel"/>
+    <w:tmpl w:val="6D386032"/>
+    <w:lvl w:ilvl="0">
+      <w:start w:val="1"/>
+      <w:numFmt w:val="bullet"/>
+      <w:lvlText w:val=""/>
+      <w:lvlJc w:val="left"/>
+      <w:pPr>
+        <w:tabs>
+          <w:tab w:val="num" w:pos="720"/>
+        </w:tabs>
+        <w:ind w:left="720" w:hanging="360"/>
+      </w:pPr>
+      <w:rPr>
+        <w:rFonts w:ascii="Symbol" w:hAnsi="Symbol" w:hint="default"/>
+        <w:sz w:val="20"/>
+      </w:rPr>
+    </w:lvl>
+    <w:lvl w:ilvl="1" w:tentative="1">
+      <w:start w:val="1"/>
+      <w:numFmt w:val="bullet"/>
+      <w:lvlText w:val="o"/>
+      <w:lvlJc w:val="left"/>
+      <w:pPr>
+        <w:tabs>
+          <w:tab w:val="num" w:pos="1440"/>
+        </w:tabs>
+        <w:ind w:left="1440" w:hanging="360"/>
+      </w:pPr>
+      <w:rPr>
+        <w:rFonts w:ascii="Courier New" w:hAnsi="Courier New" w:hint="default"/>
+        <w:sz w:val="20"/>
+      </w:rPr>
+    </w:lvl>
+    <w:lvl w:ilvl="2" w:tentative="1">
+      <w:start w:val="1"/>
+      <w:numFmt w:val="bullet"/>
+      <w:lvlText w:val=""/>
+      <w:lvlJc w:val="left"/>
+      <w:pPr>
+        <w:tabs>
+          <w:tab w:val="num" w:pos="2160"/>
+        </w:tabs>
+        <w:ind w:left="2160" w:hanging="360"/>
+      </w:pPr>
+      <w:rPr>
+        <w:rFonts w:ascii="Wingdings" w:hAnsi="Wingdings" w:hint="default"/>
+        <w:sz w:val="20"/>
+      </w:rPr>
+    </w:lvl>
+    <w:lvl w:ilvl="3" w:tentative="1">
+      <w:start w:val="1"/>
+      <w:numFmt w:val="bullet"/>
+      <w:lvlText w:val=""/>
+      <w:lvlJc w:val="left"/>
+      <w:pPr>
+        <w:tabs>
+          <w:tab w:val="num" w:pos="2880"/>
+        </w:tabs>
+        <w:ind w:left="2880" w:hanging="360"/>
+      </w:pPr>
+      <w:rPr>
+        <w:rFonts w:ascii="Wingdings" w:hAnsi="Wingdings" w:hint="default"/>
+        <w:sz w:val="20"/>
+      </w:rPr>
+    </w:lvl>
+    <w:lvl w:ilvl="4" w:tentative="1">
+      <w:start w:val="1"/>
+      <w:numFmt w:val="bullet"/>
+      <w:lvlText w:val=""/>
+      <w:lvlJc w:val="left"/>
+      <w:pPr>
+        <w:tabs>
+          <w:tab w:val="num" w:pos="3600"/>
+        </w:tabs>
+        <w:ind w:left="3600" w:hanging="360"/>
+      </w:pPr>
+      <w:rPr>
+        <w:rFonts w:ascii="Wingdings" w:hAnsi="Wingdings" w:hint="default"/>
+        <w:sz w:val="20"/>
+      </w:rPr>
+    </w:lvl>
+    <w:lvl w:ilvl="5" w:tentative="1">
+      <w:start w:val="1"/>
+      <w:numFmt w:val="bullet"/>
+      <w:lvlText w:val=""/>
+      <w:lvlJc w:val="left"/>
+      <w:pPr>
+        <w:tabs>
+          <w:tab w:val="num" w:pos="4320"/>
+        </w:tabs>
+        <w:ind w:left="4320" w:hanging="360"/>
+      </w:pPr>
+      <w:rPr>
+        <w:rFonts w:ascii="Wingdings" w:hAnsi="Wingdings" w:hint="default"/>
+        <w:sz w:val="20"/>
+      </w:rPr>
+    </w:lvl>
+    <w:lvl w:ilvl="6" w:tentative="1">
+      <w:start w:val="1"/>
+      <w:numFmt w:val="bullet"/>
+      <w:lvlText w:val=""/>
+      <w:lvlJc w:val="left"/>
+      <w:pPr>
+        <w:tabs>
+          <w:tab w:val="num" w:pos="5040"/>
+        </w:tabs>
+        <w:ind w:left="5040" w:hanging="360"/>
+      </w:pPr>
+      <w:rPr>
+        <w:rFonts w:ascii="Wingdings" w:hAnsi="Wingdings" w:hint="default"/>
+        <w:sz w:val="20"/>
+      </w:rPr>
+    </w:lvl>
+    <w:lvl w:ilvl="7" w:tentative="1">
+      <w:start w:val="1"/>
+      <w:numFmt w:val="bullet"/>
+      <w:lvlText w:val=""/>
+      <w:lvlJc w:val="left"/>
+      <w:pPr>
+        <w:tabs>
+          <w:tab w:val="num" w:pos="5760"/>
+        </w:tabs>
+        <w:ind w:left="5760" w:hanging="360"/>
+      </w:pPr>
+      <w:rPr>
+        <w:rFonts w:ascii="Wingdings" w:hAnsi="Wingdings" w:hint="default"/>
+        <w:sz w:val="20"/>
+      </w:rPr>
+    </w:lvl>
+    <w:lvl w:ilvl="8" w:tentative="1">
+      <w:start w:val="1"/>
+      <w:numFmt w:val="bullet"/>
+      <w:lvlText w:val=""/>
+      <w:lvlJc w:val="left"/>
+      <w:pPr>
+        <w:tabs>
+          <w:tab w:val="num" w:pos="6480"/>
+        </w:tabs>
+        <w:ind w:left="6480" w:hanging="360"/>
+      </w:pPr>
+      <w:rPr>
+        <w:rFonts w:ascii="Wingdings" w:hAnsi="Wingdings" w:hint="default"/>
+        <w:sz w:val="20"/>
+      </w:rPr>
+    </w:lvl>
+  </w:abstractNum>
+  <w:abstractNum w:abstractNumId="7" w15:restartNumberingAfterBreak="0">
     <w:nsid w:val="26276FB7"/>
     <w:multiLevelType w:val="multilevel"/>
     <w:tmpl w:val="3B8CCB52"/>
@@ -3955,7 +5045,7 @@
       </w:rPr>
     </w:lvl>
   </w:abstractNum>
-  <w:abstractNum w:abstractNumId="7" w15:restartNumberingAfterBreak="0">
+  <w:abstractNum w:abstractNumId="8" w15:restartNumberingAfterBreak="0">
     <w:nsid w:val="2D683663"/>
     <w:multiLevelType w:val="multilevel"/>
     <w:tmpl w:val="7390F03E"/>
@@ -4068,7 +5158,7 @@
       </w:pPr>
     </w:lvl>
   </w:abstractNum>
-  <w:abstractNum w:abstractNumId="8" w15:restartNumberingAfterBreak="0">
+  <w:abstractNum w:abstractNumId="9" w15:restartNumberingAfterBreak="0">
     <w:nsid w:val="2D986783"/>
     <w:multiLevelType w:val="multilevel"/>
     <w:tmpl w:val="D8F0F366"/>
@@ -4181,7 +5271,7 @@
       </w:pPr>
     </w:lvl>
   </w:abstractNum>
-  <w:abstractNum w:abstractNumId="9" w15:restartNumberingAfterBreak="0">
+  <w:abstractNum w:abstractNumId="10" w15:restartNumberingAfterBreak="0">
     <w:nsid w:val="2E547A65"/>
     <w:multiLevelType w:val="multilevel"/>
     <w:tmpl w:val="761ECBE2"/>
@@ -4330,7 +5420,7 @@
       </w:rPr>
     </w:lvl>
   </w:abstractNum>
-  <w:abstractNum w:abstractNumId="10" w15:restartNumberingAfterBreak="0">
+  <w:abstractNum w:abstractNumId="11" w15:restartNumberingAfterBreak="0">
     <w:nsid w:val="300272CE"/>
     <w:multiLevelType w:val="multilevel"/>
     <w:tmpl w:val="20FCE218"/>
@@ -4479,7 +5569,7 @@
       </w:rPr>
     </w:lvl>
   </w:abstractNum>
-  <w:abstractNum w:abstractNumId="11" w15:restartNumberingAfterBreak="0">
+  <w:abstractNum w:abstractNumId="12" w15:restartNumberingAfterBreak="0">
     <w:nsid w:val="313329B1"/>
     <w:multiLevelType w:val="multilevel"/>
     <w:tmpl w:val="71544392"/>
@@ -4628,7 +5718,7 @@
       </w:rPr>
     </w:lvl>
   </w:abstractNum>
-  <w:abstractNum w:abstractNumId="12" w15:restartNumberingAfterBreak="0">
+  <w:abstractNum w:abstractNumId="13" w15:restartNumberingAfterBreak="0">
     <w:nsid w:val="46C93E68"/>
     <w:multiLevelType w:val="multilevel"/>
     <w:tmpl w:val="A1BA0B88"/>
@@ -4777,7 +5867,7 @@
       </w:rPr>
     </w:lvl>
   </w:abstractNum>
-  <w:abstractNum w:abstractNumId="13" w15:restartNumberingAfterBreak="0">
+  <w:abstractNum w:abstractNumId="14" w15:restartNumberingAfterBreak="0">
     <w:nsid w:val="4F814BB7"/>
     <w:multiLevelType w:val="multilevel"/>
     <w:tmpl w:val="D6CE1A80"/>
@@ -4926,7 +6016,7 @@
       </w:rPr>
     </w:lvl>
   </w:abstractNum>
-  <w:abstractNum w:abstractNumId="14" w15:restartNumberingAfterBreak="0">
+  <w:abstractNum w:abstractNumId="15" w15:restartNumberingAfterBreak="0">
     <w:nsid w:val="528C105E"/>
     <w:multiLevelType w:val="multilevel"/>
     <w:tmpl w:val="15E07808"/>
@@ -5039,7 +6129,156 @@
       </w:pPr>
     </w:lvl>
   </w:abstractNum>
-  <w:abstractNum w:abstractNumId="15" w15:restartNumberingAfterBreak="0">
+  <w:abstractNum w:abstractNumId="16" w15:restartNumberingAfterBreak="0">
+    <w:nsid w:val="54EE7016"/>
+    <w:multiLevelType w:val="multilevel"/>
+    <w:tmpl w:val="8D4C471A"/>
+    <w:lvl w:ilvl="0">
+      <w:start w:val="1"/>
+      <w:numFmt w:val="bullet"/>
+      <w:lvlText w:val=""/>
+      <w:lvlJc w:val="left"/>
+      <w:pPr>
+        <w:tabs>
+          <w:tab w:val="num" w:pos="720"/>
+        </w:tabs>
+        <w:ind w:left="720" w:hanging="360"/>
+      </w:pPr>
+      <w:rPr>
+        <w:rFonts w:ascii="Symbol" w:hAnsi="Symbol" w:hint="default"/>
+        <w:sz w:val="20"/>
+      </w:rPr>
+    </w:lvl>
+    <w:lvl w:ilvl="1" w:tentative="1">
+      <w:start w:val="1"/>
+      <w:numFmt w:val="bullet"/>
+      <w:lvlText w:val="o"/>
+      <w:lvlJc w:val="left"/>
+      <w:pPr>
+        <w:tabs>
+          <w:tab w:val="num" w:pos="1440"/>
+        </w:tabs>
+        <w:ind w:left="1440" w:hanging="360"/>
+      </w:pPr>
+      <w:rPr>
+        <w:rFonts w:ascii="Courier New" w:hAnsi="Courier New" w:hint="default"/>
+        <w:sz w:val="20"/>
+      </w:rPr>
+    </w:lvl>
+    <w:lvl w:ilvl="2" w:tentative="1">
+      <w:start w:val="1"/>
+      <w:numFmt w:val="bullet"/>
+      <w:lvlText w:val=""/>
+      <w:lvlJc w:val="left"/>
+      <w:pPr>
+        <w:tabs>
+          <w:tab w:val="num" w:pos="2160"/>
+        </w:tabs>
+        <w:ind w:left="2160" w:hanging="360"/>
+      </w:pPr>
+      <w:rPr>
+        <w:rFonts w:ascii="Wingdings" w:hAnsi="Wingdings" w:hint="default"/>
+        <w:sz w:val="20"/>
+      </w:rPr>
+    </w:lvl>
+    <w:lvl w:ilvl="3" w:tentative="1">
+      <w:start w:val="1"/>
+      <w:numFmt w:val="bullet"/>
+      <w:lvlText w:val=""/>
+      <w:lvlJc w:val="left"/>
+      <w:pPr>
+        <w:tabs>
+          <w:tab w:val="num" w:pos="2880"/>
+        </w:tabs>
+        <w:ind w:left="2880" w:hanging="360"/>
+      </w:pPr>
+      <w:rPr>
+        <w:rFonts w:ascii="Wingdings" w:hAnsi="Wingdings" w:hint="default"/>
+        <w:sz w:val="20"/>
+      </w:rPr>
+    </w:lvl>
+    <w:lvl w:ilvl="4" w:tentative="1">
+      <w:start w:val="1"/>
+      <w:numFmt w:val="bullet"/>
+      <w:lvlText w:val=""/>
+      <w:lvlJc w:val="left"/>
+      <w:pPr>
+        <w:tabs>
+          <w:tab w:val="num" w:pos="3600"/>
+        </w:tabs>
+        <w:ind w:left="3600" w:hanging="360"/>
+      </w:pPr>
+      <w:rPr>
+        <w:rFonts w:ascii="Wingdings" w:hAnsi="Wingdings" w:hint="default"/>
+        <w:sz w:val="20"/>
+      </w:rPr>
+    </w:lvl>
+    <w:lvl w:ilvl="5" w:tentative="1">
+      <w:start w:val="1"/>
+      <w:numFmt w:val="bullet"/>
+      <w:lvlText w:val=""/>
+      <w:lvlJc w:val="left"/>
+      <w:pPr>
+        <w:tabs>
+          <w:tab w:val="num" w:pos="4320"/>
+        </w:tabs>
+        <w:ind w:left="4320" w:hanging="360"/>
+      </w:pPr>
+      <w:rPr>
+        <w:rFonts w:ascii="Wingdings" w:hAnsi="Wingdings" w:hint="default"/>
+        <w:sz w:val="20"/>
+      </w:rPr>
+    </w:lvl>
+    <w:lvl w:ilvl="6" w:tentative="1">
+      <w:start w:val="1"/>
+      <w:numFmt w:val="bullet"/>
+      <w:lvlText w:val=""/>
+      <w:lvlJc w:val="left"/>
+      <w:pPr>
+        <w:tabs>
+          <w:tab w:val="num" w:pos="5040"/>
+        </w:tabs>
+        <w:ind w:left="5040" w:hanging="360"/>
+      </w:pPr>
+      <w:rPr>
+        <w:rFonts w:ascii="Wingdings" w:hAnsi="Wingdings" w:hint="default"/>
+        <w:sz w:val="20"/>
+      </w:rPr>
+    </w:lvl>
+    <w:lvl w:ilvl="7" w:tentative="1">
+      <w:start w:val="1"/>
+      <w:numFmt w:val="bullet"/>
+      <w:lvlText w:val=""/>
+      <w:lvlJc w:val="left"/>
+      <w:pPr>
+        <w:tabs>
+          <w:tab w:val="num" w:pos="5760"/>
+        </w:tabs>
+        <w:ind w:left="5760" w:hanging="360"/>
+      </w:pPr>
+      <w:rPr>
+        <w:rFonts w:ascii="Wingdings" w:hAnsi="Wingdings" w:hint="default"/>
+        <w:sz w:val="20"/>
+      </w:rPr>
+    </w:lvl>
+    <w:lvl w:ilvl="8" w:tentative="1">
+      <w:start w:val="1"/>
+      <w:numFmt w:val="bullet"/>
+      <w:lvlText w:val=""/>
+      <w:lvlJc w:val="left"/>
+      <w:pPr>
+        <w:tabs>
+          <w:tab w:val="num" w:pos="6480"/>
+        </w:tabs>
+        <w:ind w:left="6480" w:hanging="360"/>
+      </w:pPr>
+      <w:rPr>
+        <w:rFonts w:ascii="Wingdings" w:hAnsi="Wingdings" w:hint="default"/>
+        <w:sz w:val="20"/>
+      </w:rPr>
+    </w:lvl>
+  </w:abstractNum>
+  <w:abstractNum w:abstractNumId="17" w15:restartNumberingAfterBreak="0">
     <w:nsid w:val="583355B4"/>
     <w:multiLevelType w:val="multilevel"/>
     <w:tmpl w:val="2FA8BE3A"/>
@@ -5188,7 +6427,7 @@
       </w:rPr>
     </w:lvl>
   </w:abstractNum>
-  <w:abstractNum w:abstractNumId="16" w15:restartNumberingAfterBreak="0">
+  <w:abstractNum w:abstractNumId="18" w15:restartNumberingAfterBreak="0">
     <w:nsid w:val="591C474F"/>
     <w:multiLevelType w:val="multilevel"/>
     <w:tmpl w:val="CD082F6E"/>
@@ -5301,7 +6540,305 @@
       </w:pPr>
     </w:lvl>
   </w:abstractNum>
-  <w:abstractNum w:abstractNumId="17" w15:restartNumberingAfterBreak="0">
+  <w:abstractNum w:abstractNumId="19" w15:restartNumberingAfterBreak="0">
+    <w:nsid w:val="5A1B7E93"/>
+    <w:multiLevelType w:val="multilevel"/>
+    <w:tmpl w:val="294009DC"/>
+    <w:lvl w:ilvl="0">
+      <w:start w:val="1"/>
+      <w:numFmt w:val="bullet"/>
+      <w:lvlText w:val=""/>
+      <w:lvlJc w:val="left"/>
+      <w:pPr>
+        <w:tabs>
+          <w:tab w:val="num" w:pos="720"/>
+        </w:tabs>
+        <w:ind w:left="720" w:hanging="360"/>
+      </w:pPr>
+      <w:rPr>
+        <w:rFonts w:ascii="Symbol" w:hAnsi="Symbol" w:hint="default"/>
+        <w:sz w:val="20"/>
+      </w:rPr>
+    </w:lvl>
+    <w:lvl w:ilvl="1" w:tentative="1">
+      <w:start w:val="1"/>
+      <w:numFmt w:val="bullet"/>
+      <w:lvlText w:val="o"/>
+      <w:lvlJc w:val="left"/>
+      <w:pPr>
+        <w:tabs>
+          <w:tab w:val="num" w:pos="1440"/>
+        </w:tabs>
+        <w:ind w:left="1440" w:hanging="360"/>
+      </w:pPr>
+      <w:rPr>
+        <w:rFonts w:ascii="Courier New" w:hAnsi="Courier New" w:hint="default"/>
+        <w:sz w:val="20"/>
+      </w:rPr>
+    </w:lvl>
+    <w:lvl w:ilvl="2" w:tentative="1">
+      <w:start w:val="1"/>
+      <w:numFmt w:val="bullet"/>
+      <w:lvlText w:val=""/>
+      <w:lvlJc w:val="left"/>
+      <w:pPr>
+        <w:tabs>
+          <w:tab w:val="num" w:pos="2160"/>
+        </w:tabs>
+        <w:ind w:left="2160" w:hanging="360"/>
+      </w:pPr>
+      <w:rPr>
+        <w:rFonts w:ascii="Wingdings" w:hAnsi="Wingdings" w:hint="default"/>
+        <w:sz w:val="20"/>
+      </w:rPr>
+    </w:lvl>
+    <w:lvl w:ilvl="3" w:tentative="1">
+      <w:start w:val="1"/>
+      <w:numFmt w:val="bullet"/>
+      <w:lvlText w:val=""/>
+      <w:lvlJc w:val="left"/>
+      <w:pPr>
+        <w:tabs>
+          <w:tab w:val="num" w:pos="2880"/>
+        </w:tabs>
+        <w:ind w:left="2880" w:hanging="360"/>
+      </w:pPr>
+      <w:rPr>
+        <w:rFonts w:ascii="Wingdings" w:hAnsi="Wingdings" w:hint="default"/>
+        <w:sz w:val="20"/>
+      </w:rPr>
+    </w:lvl>
+    <w:lvl w:ilvl="4" w:tentative="1">
+      <w:start w:val="1"/>
+      <w:numFmt w:val="bullet"/>
+      <w:lvlText w:val=""/>
+      <w:lvlJc w:val="left"/>
+      <w:pPr>
+        <w:tabs>
+          <w:tab w:val="num" w:pos="3600"/>
+        </w:tabs>
+        <w:ind w:left="3600" w:hanging="360"/>
+      </w:pPr>
+      <w:rPr>
+        <w:rFonts w:ascii="Wingdings" w:hAnsi="Wingdings" w:hint="default"/>
+        <w:sz w:val="20"/>
+      </w:rPr>
+    </w:lvl>
+    <w:lvl w:ilvl="5" w:tentative="1">
+      <w:start w:val="1"/>
+      <w:numFmt w:val="bullet"/>
+      <w:lvlText w:val=""/>
+      <w:lvlJc w:val="left"/>
+      <w:pPr>
+        <w:tabs>
+          <w:tab w:val="num" w:pos="4320"/>
+        </w:tabs>
+        <w:ind w:left="4320" w:hanging="360"/>
+      </w:pPr>
+      <w:rPr>
+        <w:rFonts w:ascii="Wingdings" w:hAnsi="Wingdings" w:hint="default"/>
+        <w:sz w:val="20"/>
+      </w:rPr>
+    </w:lvl>
+    <w:lvl w:ilvl="6" w:tentative="1">
+      <w:start w:val="1"/>
+      <w:numFmt w:val="bullet"/>
+      <w:lvlText w:val=""/>
+      <w:lvlJc w:val="left"/>
+      <w:pPr>
+        <w:tabs>
+          <w:tab w:val="num" w:pos="5040"/>
+        </w:tabs>
+        <w:ind w:left="5040" w:hanging="360"/>
+      </w:pPr>
+      <w:rPr>
+        <w:rFonts w:ascii="Wingdings" w:hAnsi="Wingdings" w:hint="default"/>
+        <w:sz w:val="20"/>
+      </w:rPr>
+    </w:lvl>
+    <w:lvl w:ilvl="7" w:tentative="1">
+      <w:start w:val="1"/>
+      <w:numFmt w:val="bullet"/>
+      <w:lvlText w:val=""/>
+      <w:lvlJc w:val="left"/>
+      <w:pPr>
+        <w:tabs>
+          <w:tab w:val="num" w:pos="5760"/>
+        </w:tabs>
+        <w:ind w:left="5760" w:hanging="360"/>
+      </w:pPr>
+      <w:rPr>
+        <w:rFonts w:ascii="Wingdings" w:hAnsi="Wingdings" w:hint="default"/>
+        <w:sz w:val="20"/>
+      </w:rPr>
+    </w:lvl>
+    <w:lvl w:ilvl="8" w:tentative="1">
+      <w:start w:val="1"/>
+      <w:numFmt w:val="bullet"/>
+      <w:lvlText w:val=""/>
+      <w:lvlJc w:val="left"/>
+      <w:pPr>
+        <w:tabs>
+          <w:tab w:val="num" w:pos="6480"/>
+        </w:tabs>
+        <w:ind w:left="6480" w:hanging="360"/>
+      </w:pPr>
+      <w:rPr>
+        <w:rFonts w:ascii="Wingdings" w:hAnsi="Wingdings" w:hint="default"/>
+        <w:sz w:val="20"/>
+      </w:rPr>
+    </w:lvl>
+  </w:abstractNum>
+  <w:abstractNum w:abstractNumId="20" w15:restartNumberingAfterBreak="0">
+    <w:nsid w:val="66577581"/>
+    <w:multiLevelType w:val="multilevel"/>
+    <w:tmpl w:val="5F04A984"/>
+    <w:lvl w:ilvl="0">
+      <w:start w:val="1"/>
+      <w:numFmt w:val="bullet"/>
+      <w:lvlText w:val=""/>
+      <w:lvlJc w:val="left"/>
+      <w:pPr>
+        <w:tabs>
+          <w:tab w:val="num" w:pos="720"/>
+        </w:tabs>
+        <w:ind w:left="720" w:hanging="360"/>
+      </w:pPr>
+      <w:rPr>
+        <w:rFonts w:ascii="Symbol" w:hAnsi="Symbol" w:hint="default"/>
+        <w:sz w:val="20"/>
+      </w:rPr>
+    </w:lvl>
+    <w:lvl w:ilvl="1" w:tentative="1">
+      <w:start w:val="1"/>
+      <w:numFmt w:val="bullet"/>
+      <w:lvlText w:val="o"/>
+      <w:lvlJc w:val="left"/>
+      <w:pPr>
+        <w:tabs>
+          <w:tab w:val="num" w:pos="1440"/>
+        </w:tabs>
+        <w:ind w:left="1440" w:hanging="360"/>
+      </w:pPr>
+      <w:rPr>
+        <w:rFonts w:ascii="Courier New" w:hAnsi="Courier New" w:hint="default"/>
+        <w:sz w:val="20"/>
+      </w:rPr>
+    </w:lvl>
+    <w:lvl w:ilvl="2" w:tentative="1">
+      <w:start w:val="1"/>
+      <w:numFmt w:val="bullet"/>
+      <w:lvlText w:val=""/>
+      <w:lvlJc w:val="left"/>
+      <w:pPr>
+        <w:tabs>
+          <w:tab w:val="num" w:pos="2160"/>
+        </w:tabs>
+        <w:ind w:left="2160" w:hanging="360"/>
+      </w:pPr>
+      <w:rPr>
+        <w:rFonts w:ascii="Wingdings" w:hAnsi="Wingdings" w:hint="default"/>
+        <w:sz w:val="20"/>
+      </w:rPr>
+    </w:lvl>
+    <w:lvl w:ilvl="3" w:tentative="1">
+      <w:start w:val="1"/>
+      <w:numFmt w:val="bullet"/>
+      <w:lvlText w:val=""/>
+      <w:lvlJc w:val="left"/>
+      <w:pPr>
+        <w:tabs>
+          <w:tab w:val="num" w:pos="2880"/>
+        </w:tabs>
+        <w:ind w:left="2880" w:hanging="360"/>
+      </w:pPr>
+      <w:rPr>
+        <w:rFonts w:ascii="Wingdings" w:hAnsi="Wingdings" w:hint="default"/>
+        <w:sz w:val="20"/>
+      </w:rPr>
+    </w:lvl>
+    <w:lvl w:ilvl="4" w:tentative="1">
+      <w:start w:val="1"/>
+      <w:numFmt w:val="bullet"/>
+      <w:lvlText w:val=""/>
+      <w:lvlJc w:val="left"/>
+      <w:pPr>
+        <w:tabs>
+          <w:tab w:val="num" w:pos="3600"/>
+        </w:tabs>
+        <w:ind w:left="3600" w:hanging="360"/>
+      </w:pPr>
+      <w:rPr>
+        <w:rFonts w:ascii="Wingdings" w:hAnsi="Wingdings" w:hint="default"/>
+        <w:sz w:val="20"/>
+      </w:rPr>
+    </w:lvl>
+    <w:lvl w:ilvl="5" w:tentative="1">
+      <w:start w:val="1"/>
+      <w:numFmt w:val="bullet"/>
+      <w:lvlText w:val=""/>
+      <w:lvlJc w:val="left"/>
+      <w:pPr>
+        <w:tabs>
+          <w:tab w:val="num" w:pos="4320"/>
+        </w:tabs>
+        <w:ind w:left="4320" w:hanging="360"/>
+      </w:pPr>
+      <w:rPr>
+        <w:rFonts w:ascii="Wingdings" w:hAnsi="Wingdings" w:hint="default"/>
+        <w:sz w:val="20"/>
+      </w:rPr>
+    </w:lvl>
+    <w:lvl w:ilvl="6" w:tentative="1">
+      <w:start w:val="1"/>
+      <w:numFmt w:val="bullet"/>
+      <w:lvlText w:val=""/>
+      <w:lvlJc w:val="left"/>
+      <w:pPr>
+        <w:tabs>
+          <w:tab w:val="num" w:pos="5040"/>
+        </w:tabs>
+        <w:ind w:left="5040" w:hanging="360"/>
+      </w:pPr>
+      <w:rPr>
+        <w:rFonts w:ascii="Wingdings" w:hAnsi="Wingdings" w:hint="default"/>
+        <w:sz w:val="20"/>
+      </w:rPr>
+    </w:lvl>
+    <w:lvl w:ilvl="7" w:tentative="1">
+      <w:start w:val="1"/>
+      <w:numFmt w:val="bullet"/>
+      <w:lvlText w:val=""/>
+      <w:lvlJc w:val="left"/>
+      <w:pPr>
+        <w:tabs>
+          <w:tab w:val="num" w:pos="5760"/>
+        </w:tabs>
+        <w:ind w:left="5760" w:hanging="360"/>
+      </w:pPr>
+      <w:rPr>
+        <w:rFonts w:ascii="Wingdings" w:hAnsi="Wingdings" w:hint="default"/>
+        <w:sz w:val="20"/>
+      </w:rPr>
+    </w:lvl>
+    <w:lvl w:ilvl="8" w:tentative="1">
+      <w:start w:val="1"/>
+      <w:numFmt w:val="bullet"/>
+      <w:lvlText w:val=""/>
+      <w:lvlJc w:val="left"/>
+      <w:pPr>
+        <w:tabs>
+          <w:tab w:val="num" w:pos="6480"/>
+        </w:tabs>
+        <w:ind w:left="6480" w:hanging="360"/>
+      </w:pPr>
+      <w:rPr>
+        <w:rFonts w:ascii="Wingdings" w:hAnsi="Wingdings" w:hint="default"/>
+        <w:sz w:val="20"/>
+      </w:rPr>
+    </w:lvl>
+  </w:abstractNum>
+  <w:abstractNum w:abstractNumId="21" w15:restartNumberingAfterBreak="0">
     <w:nsid w:val="723E079B"/>
     <w:multiLevelType w:val="multilevel"/>
     <w:tmpl w:val="CD445EB0"/>
@@ -5414,7 +6951,7 @@
       </w:pPr>
     </w:lvl>
   </w:abstractNum>
-  <w:abstractNum w:abstractNumId="18" w15:restartNumberingAfterBreak="0">
+  <w:abstractNum w:abstractNumId="22" w15:restartNumberingAfterBreak="0">
     <w:nsid w:val="728D6156"/>
     <w:multiLevelType w:val="multilevel"/>
     <w:tmpl w:val="B418A08A"/>
@@ -5527,7 +7064,7 @@
       </w:pPr>
     </w:lvl>
   </w:abstractNum>
-  <w:abstractNum w:abstractNumId="19" w15:restartNumberingAfterBreak="0">
+  <w:abstractNum w:abstractNumId="23" w15:restartNumberingAfterBreak="0">
     <w:nsid w:val="7386197F"/>
     <w:multiLevelType w:val="multilevel"/>
     <w:tmpl w:val="92288156"/>
@@ -5640,7 +7177,7 @@
       </w:pPr>
     </w:lvl>
   </w:abstractNum>
-  <w:abstractNum w:abstractNumId="20" w15:restartNumberingAfterBreak="0">
+  <w:abstractNum w:abstractNumId="24" w15:restartNumberingAfterBreak="0">
     <w:nsid w:val="73C1008E"/>
     <w:multiLevelType w:val="multilevel"/>
     <w:tmpl w:val="FBC457C8"/>
@@ -5789,7 +7326,7 @@
       </w:rPr>
     </w:lvl>
   </w:abstractNum>
-  <w:abstractNum w:abstractNumId="21" w15:restartNumberingAfterBreak="0">
+  <w:abstractNum w:abstractNumId="25" w15:restartNumberingAfterBreak="0">
     <w:nsid w:val="76D47FB2"/>
     <w:multiLevelType w:val="multilevel"/>
     <w:tmpl w:val="2CC4BD7A"/>
@@ -5938,7 +7475,7 @@
       </w:rPr>
     </w:lvl>
   </w:abstractNum>
-  <w:abstractNum w:abstractNumId="22" w15:restartNumberingAfterBreak="0">
+  <w:abstractNum w:abstractNumId="26" w15:restartNumberingAfterBreak="0">
     <w:nsid w:val="77350E10"/>
     <w:multiLevelType w:val="multilevel"/>
     <w:tmpl w:val="58A2C8E0"/>
@@ -6052,40 +7589,40 @@
     </w:lvl>
   </w:abstractNum>
   <w:num w:numId="1">
-    <w:abstractNumId w:val="20"/>
+    <w:abstractNumId w:val="24"/>
   </w:num>
   <w:num w:numId="2">
-    <w:abstractNumId w:val="22"/>
+    <w:abstractNumId w:val="26"/>
   </w:num>
   <w:num w:numId="3">
-    <w:abstractNumId w:val="19"/>
+    <w:abstractNumId w:val="23"/>
   </w:num>
   <w:num w:numId="4">
-    <w:abstractNumId w:val="11"/>
+    <w:abstractNumId w:val="12"/>
   </w:num>
   <w:num w:numId="5">
-    <w:abstractNumId w:val="12"/>
+    <w:abstractNumId w:val="13"/>
   </w:num>
   <w:num w:numId="6">
-    <w:abstractNumId w:val="16"/>
+    <w:abstractNumId w:val="18"/>
   </w:num>
   <w:num w:numId="7">
-    <w:abstractNumId w:val="21"/>
+    <w:abstractNumId w:val="25"/>
   </w:num>
   <w:num w:numId="8">
     <w:abstractNumId w:val="4"/>
   </w:num>
   <w:num w:numId="9">
-    <w:abstractNumId w:val="18"/>
+    <w:abstractNumId w:val="22"/>
   </w:num>
   <w:num w:numId="10">
-    <w:abstractNumId w:val="8"/>
+    <w:abstractNumId w:val="9"/>
   </w:num>
   <w:num w:numId="11">
     <w:abstractNumId w:val="1"/>
   </w:num>
   <w:num w:numId="12">
-    <w:abstractNumId w:val="13"/>
+    <w:abstractNumId w:val="14"/>
   </w:num>
   <w:num w:numId="13">
     <w:abstractNumId w:val="3"/>
@@ -6094,31 +7631,43 @@
     <w:abstractNumId w:val="2"/>
   </w:num>
   <w:num w:numId="15">
-    <w:abstractNumId w:val="9"/>
+    <w:abstractNumId w:val="10"/>
   </w:num>
   <w:num w:numId="16">
-    <w:abstractNumId w:val="10"/>
+    <w:abstractNumId w:val="11"/>
   </w:num>
   <w:num w:numId="17">
     <w:abstractNumId w:val="5"/>
   </w:num>
   <w:num w:numId="18">
+    <w:abstractNumId w:val="21"/>
+  </w:num>
+  <w:num w:numId="19">
+    <w:abstractNumId w:val="15"/>
+  </w:num>
+  <w:num w:numId="20">
+    <w:abstractNumId w:val="7"/>
+  </w:num>
+  <w:num w:numId="21">
     <w:abstractNumId w:val="17"/>
   </w:num>
-  <w:num w:numId="19">
-    <w:abstractNumId w:val="14"/>
-  </w:num>
-  <w:num w:numId="20">
-    <w:abstractNumId w:val="6"/>
-  </w:num>
-  <w:num w:numId="21">
-    <w:abstractNumId w:val="15"/>
-  </w:num>
   <w:num w:numId="22">
-    <w:abstractNumId w:val="7"/>
+    <w:abstractNumId w:val="8"/>
   </w:num>
   <w:num w:numId="23">
     <w:abstractNumId w:val="0"/>
+  </w:num>
+  <w:num w:numId="24">
+    <w:abstractNumId w:val="20"/>
+  </w:num>
+  <w:num w:numId="25">
+    <w:abstractNumId w:val="19"/>
+  </w:num>
+  <w:num w:numId="26">
+    <w:abstractNumId w:val="16"/>
+  </w:num>
+  <w:num w:numId="27">
+    <w:abstractNumId w:val="6"/>
   </w:num>
 </w:numbering>
 </file>
@@ -6759,6 +8308,18 @@
     <w:basedOn w:val="DefaultParagraphFont"/>
     <w:rsid w:val="009E42D3"/>
   </w:style>
+  <w:style w:type="character" w:styleId="Hyperlink">
+    <w:name w:val="Hyperlink"/>
+    <w:basedOn w:val="DefaultParagraphFont"/>
+    <w:uiPriority w:val="99"/>
+    <w:semiHidden/>
+    <w:unhideWhenUsed/>
+    <w:rsid w:val="002915D0"/>
+    <w:rPr>
+      <w:color w:val="0000FF"/>
+      <w:u w:val="single"/>
+    </w:rPr>
+  </w:style>
 </w:styles>
 </file>
 

</xml_diff>